<commit_message>
K-Means and Fuzzy C-Means code ready
</commit_message>
<xml_diff>
--- a/src/aw-daniel/Raport do Kamili/Analiza wstępna.docx
+++ b/src/aw-daniel/Raport do Kamili/Analiza wstępna.docx
@@ -17,7 +17,15 @@
     </w:p>
     <w:p>
       <w:r>
-        <w:t>Dane wykorzystane w badaniu zostały pozyskane z Banku Danych Lokalnych Głównego Urzędu Statystycznego (BDL GUS). Pierwotny zbiór obejmował 56 zmiennych stanowiących potencjalne predyktory rozwoju regionalnego w wymiarze demograficznym, gospodarczym, infrastrukturalnym oraz społecznym.</w:t>
+        <w:t xml:space="preserve">Dane wykorzystane w badaniu zostały pozyskane z Banku Danych Lokalnych Głównego Urzędu Statystycznego (BDL GUS). Pierwotny zbiór obejmował 56 zmiennych stanowiących potencjalne </w:t>
+      </w:r>
+      <w:proofErr w:type="spellStart"/>
+      <w:r>
+        <w:t>predyktory</w:t>
+      </w:r>
+      <w:proofErr w:type="spellEnd"/>
+      <w:r>
+        <w:t xml:space="preserve"> rozwoju regionalnego w wymiarze demograficznym, gospodarczym, infrastrukturalnym oraz społecznym.</w:t>
       </w:r>
     </w:p>
     <w:p>
@@ -520,17 +528,57 @@
                 <w14:ligatures w14:val="none"/>
               </w:rPr>
             </w:pPr>
-            <w:r>
-              <w:rPr>
-                <w:rFonts w:ascii="Calibri" w:eastAsia="Times New Roman" w:hAnsi="Calibri" w:cs="Calibri"/>
-                <w:color w:val="000000"/>
-                <w:kern w:val="0"/>
-                <w:sz w:val="18"/>
-                <w:szCs w:val="18"/>
-                <w:lang w:eastAsia="pl-PL"/>
-                <w14:ligatures w14:val="none"/>
-              </w:rPr>
-              <w:t>wskaznik urbanizacji 2021 - spis powszechny - ile osob % mieszka w miastach</w:t>
+            <w:proofErr w:type="spellStart"/>
+            <w:r>
+              <w:rPr>
+                <w:rFonts w:ascii="Calibri" w:eastAsia="Times New Roman" w:hAnsi="Calibri" w:cs="Calibri"/>
+                <w:color w:val="000000"/>
+                <w:kern w:val="0"/>
+                <w:sz w:val="18"/>
+                <w:szCs w:val="18"/>
+                <w:lang w:eastAsia="pl-PL"/>
+                <w14:ligatures w14:val="none"/>
+              </w:rPr>
+              <w:t>wskaznik</w:t>
+            </w:r>
+            <w:proofErr w:type="spellEnd"/>
+            <w:r>
+              <w:rPr>
+                <w:rFonts w:ascii="Calibri" w:eastAsia="Times New Roman" w:hAnsi="Calibri" w:cs="Calibri"/>
+                <w:color w:val="000000"/>
+                <w:kern w:val="0"/>
+                <w:sz w:val="18"/>
+                <w:szCs w:val="18"/>
+                <w:lang w:eastAsia="pl-PL"/>
+                <w14:ligatures w14:val="none"/>
+              </w:rPr>
+              <w:t xml:space="preserve"> urbanizacji 2021 - spis powszechny - ile </w:t>
+            </w:r>
+            <w:proofErr w:type="spellStart"/>
+            <w:r>
+              <w:rPr>
+                <w:rFonts w:ascii="Calibri" w:eastAsia="Times New Roman" w:hAnsi="Calibri" w:cs="Calibri"/>
+                <w:color w:val="000000"/>
+                <w:kern w:val="0"/>
+                <w:sz w:val="18"/>
+                <w:szCs w:val="18"/>
+                <w:lang w:eastAsia="pl-PL"/>
+                <w14:ligatures w14:val="none"/>
+              </w:rPr>
+              <w:t>osob</w:t>
+            </w:r>
+            <w:proofErr w:type="spellEnd"/>
+            <w:r>
+              <w:rPr>
+                <w:rFonts w:ascii="Calibri" w:eastAsia="Times New Roman" w:hAnsi="Calibri" w:cs="Calibri"/>
+                <w:color w:val="000000"/>
+                <w:kern w:val="0"/>
+                <w:sz w:val="18"/>
+                <w:szCs w:val="18"/>
+                <w:lang w:eastAsia="pl-PL"/>
+                <w14:ligatures w14:val="none"/>
+              </w:rPr>
+              <w:t xml:space="preserve"> % mieszka w miastach</w:t>
             </w:r>
           </w:p>
         </w:tc>
@@ -662,7 +710,85 @@
                 <w:lang w:eastAsia="pl-PL"/>
                 <w14:ligatures w14:val="none"/>
               </w:rPr>
-              <w:t>emigranci - 2021 sp - odsetek emigrantów w % względem ludnosci wojewodztwa - czasowy pobyt za granica</w:t>
+              <w:t xml:space="preserve">emigranci - 2021 </w:t>
+            </w:r>
+            <w:proofErr w:type="spellStart"/>
+            <w:r>
+              <w:rPr>
+                <w:rFonts w:ascii="Calibri" w:eastAsia="Times New Roman" w:hAnsi="Calibri" w:cs="Calibri"/>
+                <w:color w:val="000000"/>
+                <w:kern w:val="0"/>
+                <w:sz w:val="18"/>
+                <w:szCs w:val="18"/>
+                <w:lang w:eastAsia="pl-PL"/>
+                <w14:ligatures w14:val="none"/>
+              </w:rPr>
+              <w:t>sp</w:t>
+            </w:r>
+            <w:proofErr w:type="spellEnd"/>
+            <w:r>
+              <w:rPr>
+                <w:rFonts w:ascii="Calibri" w:eastAsia="Times New Roman" w:hAnsi="Calibri" w:cs="Calibri"/>
+                <w:color w:val="000000"/>
+                <w:kern w:val="0"/>
+                <w:sz w:val="18"/>
+                <w:szCs w:val="18"/>
+                <w:lang w:eastAsia="pl-PL"/>
+                <w14:ligatures w14:val="none"/>
+              </w:rPr>
+              <w:t xml:space="preserve"> - odsetek emigrantów w % względem </w:t>
+            </w:r>
+            <w:proofErr w:type="spellStart"/>
+            <w:r>
+              <w:rPr>
+                <w:rFonts w:ascii="Calibri" w:eastAsia="Times New Roman" w:hAnsi="Calibri" w:cs="Calibri"/>
+                <w:color w:val="000000"/>
+                <w:kern w:val="0"/>
+                <w:sz w:val="18"/>
+                <w:szCs w:val="18"/>
+                <w:lang w:eastAsia="pl-PL"/>
+                <w14:ligatures w14:val="none"/>
+              </w:rPr>
+              <w:t>ludnosci</w:t>
+            </w:r>
+            <w:proofErr w:type="spellEnd"/>
+            <w:r>
+              <w:rPr>
+                <w:rFonts w:ascii="Calibri" w:eastAsia="Times New Roman" w:hAnsi="Calibri" w:cs="Calibri"/>
+                <w:color w:val="000000"/>
+                <w:kern w:val="0"/>
+                <w:sz w:val="18"/>
+                <w:szCs w:val="18"/>
+                <w:lang w:eastAsia="pl-PL"/>
+                <w14:ligatures w14:val="none"/>
+              </w:rPr>
+              <w:t xml:space="preserve"> </w:t>
+            </w:r>
+            <w:proofErr w:type="spellStart"/>
+            <w:r>
+              <w:rPr>
+                <w:rFonts w:ascii="Calibri" w:eastAsia="Times New Roman" w:hAnsi="Calibri" w:cs="Calibri"/>
+                <w:color w:val="000000"/>
+                <w:kern w:val="0"/>
+                <w:sz w:val="18"/>
+                <w:szCs w:val="18"/>
+                <w:lang w:eastAsia="pl-PL"/>
+                <w14:ligatures w14:val="none"/>
+              </w:rPr>
+              <w:t>wojewodztwa</w:t>
+            </w:r>
+            <w:proofErr w:type="spellEnd"/>
+            <w:r>
+              <w:rPr>
+                <w:rFonts w:ascii="Calibri" w:eastAsia="Times New Roman" w:hAnsi="Calibri" w:cs="Calibri"/>
+                <w:color w:val="000000"/>
+                <w:kern w:val="0"/>
+                <w:sz w:val="18"/>
+                <w:szCs w:val="18"/>
+                <w:lang w:eastAsia="pl-PL"/>
+                <w14:ligatures w14:val="none"/>
+              </w:rPr>
+              <w:t xml:space="preserve"> - czasowy pobyt za granica</w:t>
             </w:r>
           </w:p>
         </w:tc>
@@ -794,7 +920,33 @@
                 <w:lang w:eastAsia="pl-PL"/>
                 <w14:ligatures w14:val="none"/>
               </w:rPr>
-              <w:t>LUDNOŚĆ PRZYBYŁA DO MIEJSCOWOŚCI AKTUALNEGO ZAMIESZKANIA W LATACH 2011-2021  Z INNEGO MIEJSCA W KRAJU</w:t>
+              <w:t>LUDNOŚĆ PRZYBYŁA DO MIEJSCOWOŚCI AKTUALNEGO ZAMIESZKANIA W LATACH 2011-</w:t>
+            </w:r>
+            <w:proofErr w:type="gramStart"/>
+            <w:r>
+              <w:rPr>
+                <w:rFonts w:ascii="Calibri" w:eastAsia="Times New Roman" w:hAnsi="Calibri" w:cs="Calibri"/>
+                <w:color w:val="000000"/>
+                <w:kern w:val="0"/>
+                <w:sz w:val="18"/>
+                <w:szCs w:val="18"/>
+                <w:lang w:eastAsia="pl-PL"/>
+                <w14:ligatures w14:val="none"/>
+              </w:rPr>
+              <w:t>2021  Z</w:t>
+            </w:r>
+            <w:proofErr w:type="gramEnd"/>
+            <w:r>
+              <w:rPr>
+                <w:rFonts w:ascii="Calibri" w:eastAsia="Times New Roman" w:hAnsi="Calibri" w:cs="Calibri"/>
+                <w:color w:val="000000"/>
+                <w:kern w:val="0"/>
+                <w:sz w:val="18"/>
+                <w:szCs w:val="18"/>
+                <w:lang w:eastAsia="pl-PL"/>
+                <w14:ligatures w14:val="none"/>
+              </w:rPr>
+              <w:t xml:space="preserve"> INNEGO MIEJSCA W KRAJU</w:t>
             </w:r>
           </w:p>
         </w:tc>
@@ -1454,7 +1606,33 @@
                 <w:lang w:eastAsia="pl-PL"/>
                 <w14:ligatures w14:val="none"/>
               </w:rPr>
-              <w:t>studencki uczelni na 1,000 ludnosci - 2024</w:t>
+              <w:t xml:space="preserve">studencki uczelni na 1,000 </w:t>
+            </w:r>
+            <w:proofErr w:type="spellStart"/>
+            <w:r>
+              <w:rPr>
+                <w:rFonts w:ascii="Calibri" w:eastAsia="Times New Roman" w:hAnsi="Calibri" w:cs="Calibri"/>
+                <w:color w:val="000000"/>
+                <w:kern w:val="0"/>
+                <w:sz w:val="18"/>
+                <w:szCs w:val="18"/>
+                <w:lang w:eastAsia="pl-PL"/>
+                <w14:ligatures w14:val="none"/>
+              </w:rPr>
+              <w:t>ludnosci</w:t>
+            </w:r>
+            <w:proofErr w:type="spellEnd"/>
+            <w:r>
+              <w:rPr>
+                <w:rFonts w:ascii="Calibri" w:eastAsia="Times New Roman" w:hAnsi="Calibri" w:cs="Calibri"/>
+                <w:color w:val="000000"/>
+                <w:kern w:val="0"/>
+                <w:sz w:val="18"/>
+                <w:szCs w:val="18"/>
+                <w:lang w:eastAsia="pl-PL"/>
+                <w14:ligatures w14:val="none"/>
+              </w:rPr>
+              <w:t xml:space="preserve"> - 2024</w:t>
             </w:r>
           </w:p>
         </w:tc>
@@ -1577,17 +1755,57 @@
                 <w14:ligatures w14:val="none"/>
               </w:rPr>
             </w:pPr>
-            <w:r>
-              <w:rPr>
-                <w:rFonts w:ascii="Calibri" w:eastAsia="Times New Roman" w:hAnsi="Calibri" w:cs="Calibri"/>
-                <w:color w:val="000000"/>
-                <w:kern w:val="0"/>
-                <w:sz w:val="18"/>
-                <w:szCs w:val="18"/>
-                <w:lang w:eastAsia="pl-PL"/>
-                <w14:ligatures w14:val="none"/>
-              </w:rPr>
-              <w:t>zdawalnsoc egzaminow maturalnych - 2024</w:t>
+            <w:proofErr w:type="spellStart"/>
+            <w:r>
+              <w:rPr>
+                <w:rFonts w:ascii="Calibri" w:eastAsia="Times New Roman" w:hAnsi="Calibri" w:cs="Calibri"/>
+                <w:color w:val="000000"/>
+                <w:kern w:val="0"/>
+                <w:sz w:val="18"/>
+                <w:szCs w:val="18"/>
+                <w:lang w:eastAsia="pl-PL"/>
+                <w14:ligatures w14:val="none"/>
+              </w:rPr>
+              <w:t>zdawalnsoc</w:t>
+            </w:r>
+            <w:proofErr w:type="spellEnd"/>
+            <w:r>
+              <w:rPr>
+                <w:rFonts w:ascii="Calibri" w:eastAsia="Times New Roman" w:hAnsi="Calibri" w:cs="Calibri"/>
+                <w:color w:val="000000"/>
+                <w:kern w:val="0"/>
+                <w:sz w:val="18"/>
+                <w:szCs w:val="18"/>
+                <w:lang w:eastAsia="pl-PL"/>
+                <w14:ligatures w14:val="none"/>
+              </w:rPr>
+              <w:t xml:space="preserve"> </w:t>
+            </w:r>
+            <w:proofErr w:type="spellStart"/>
+            <w:r>
+              <w:rPr>
+                <w:rFonts w:ascii="Calibri" w:eastAsia="Times New Roman" w:hAnsi="Calibri" w:cs="Calibri"/>
+                <w:color w:val="000000"/>
+                <w:kern w:val="0"/>
+                <w:sz w:val="18"/>
+                <w:szCs w:val="18"/>
+                <w:lang w:eastAsia="pl-PL"/>
+                <w14:ligatures w14:val="none"/>
+              </w:rPr>
+              <w:t>egzaminow</w:t>
+            </w:r>
+            <w:proofErr w:type="spellEnd"/>
+            <w:r>
+              <w:rPr>
+                <w:rFonts w:ascii="Calibri" w:eastAsia="Times New Roman" w:hAnsi="Calibri" w:cs="Calibri"/>
+                <w:color w:val="000000"/>
+                <w:kern w:val="0"/>
+                <w:sz w:val="18"/>
+                <w:szCs w:val="18"/>
+                <w:lang w:eastAsia="pl-PL"/>
+                <w14:ligatures w14:val="none"/>
+              </w:rPr>
+              <w:t xml:space="preserve"> maturalnych - 2024</w:t>
             </w:r>
           </w:p>
         </w:tc>
@@ -1709,18 +1927,46 @@
                 <w14:ligatures w14:val="none"/>
               </w:rPr>
             </w:pPr>
-            <w:r>
-              <w:rPr>
-                <w:rFonts w:ascii="Calibri" w:eastAsia="Times New Roman" w:hAnsi="Calibri" w:cs="Calibri"/>
-                <w:color w:val="000000"/>
-                <w:kern w:val="0"/>
-                <w:sz w:val="18"/>
-                <w:szCs w:val="18"/>
-                <w:lang w:eastAsia="pl-PL"/>
-                <w14:ligatures w14:val="none"/>
-              </w:rPr>
-              <w:t>pkb na osobę w 2023 w 1000 zl</w:t>
-            </w:r>
+            <w:proofErr w:type="spellStart"/>
+            <w:r>
+              <w:rPr>
+                <w:rFonts w:ascii="Calibri" w:eastAsia="Times New Roman" w:hAnsi="Calibri" w:cs="Calibri"/>
+                <w:color w:val="000000"/>
+                <w:kern w:val="0"/>
+                <w:sz w:val="18"/>
+                <w:szCs w:val="18"/>
+                <w:lang w:eastAsia="pl-PL"/>
+                <w14:ligatures w14:val="none"/>
+              </w:rPr>
+              <w:t>pkb</w:t>
+            </w:r>
+            <w:proofErr w:type="spellEnd"/>
+            <w:r>
+              <w:rPr>
+                <w:rFonts w:ascii="Calibri" w:eastAsia="Times New Roman" w:hAnsi="Calibri" w:cs="Calibri"/>
+                <w:color w:val="000000"/>
+                <w:kern w:val="0"/>
+                <w:sz w:val="18"/>
+                <w:szCs w:val="18"/>
+                <w:lang w:eastAsia="pl-PL"/>
+                <w14:ligatures w14:val="none"/>
+              </w:rPr>
+              <w:t xml:space="preserve"> na osobę w 2023 w 1000 </w:t>
+            </w:r>
+            <w:proofErr w:type="spellStart"/>
+            <w:r>
+              <w:rPr>
+                <w:rFonts w:ascii="Calibri" w:eastAsia="Times New Roman" w:hAnsi="Calibri" w:cs="Calibri"/>
+                <w:color w:val="000000"/>
+                <w:kern w:val="0"/>
+                <w:sz w:val="18"/>
+                <w:szCs w:val="18"/>
+                <w:lang w:eastAsia="pl-PL"/>
+                <w14:ligatures w14:val="none"/>
+              </w:rPr>
+              <w:t>zl</w:t>
+            </w:r>
+            <w:proofErr w:type="spellEnd"/>
           </w:p>
         </w:tc>
       </w:tr>
@@ -1983,7 +2229,33 @@
                 <w:lang w:eastAsia="pl-PL"/>
                 <w14:ligatures w14:val="none"/>
               </w:rPr>
-              <w:t>dochody budżetów województw na 1 mieszkanca w roku 2024 w dziesiątkach złotych]</w:t>
+              <w:t xml:space="preserve">dochody budżetów województw na 1 </w:t>
+            </w:r>
+            <w:proofErr w:type="spellStart"/>
+            <w:r>
+              <w:rPr>
+                <w:rFonts w:ascii="Calibri" w:eastAsia="Times New Roman" w:hAnsi="Calibri" w:cs="Calibri"/>
+                <w:color w:val="000000"/>
+                <w:kern w:val="0"/>
+                <w:sz w:val="18"/>
+                <w:szCs w:val="18"/>
+                <w:lang w:eastAsia="pl-PL"/>
+                <w14:ligatures w14:val="none"/>
+              </w:rPr>
+              <w:t>mieszkanca</w:t>
+            </w:r>
+            <w:proofErr w:type="spellEnd"/>
+            <w:r>
+              <w:rPr>
+                <w:rFonts w:ascii="Calibri" w:eastAsia="Times New Roman" w:hAnsi="Calibri" w:cs="Calibri"/>
+                <w:color w:val="000000"/>
+                <w:kern w:val="0"/>
+                <w:sz w:val="18"/>
+                <w:szCs w:val="18"/>
+                <w:lang w:eastAsia="pl-PL"/>
+                <w14:ligatures w14:val="none"/>
+              </w:rPr>
+              <w:t xml:space="preserve"> w roku 2024 w dziesiątkach złotych]</w:t>
             </w:r>
           </w:p>
         </w:tc>
@@ -2379,7 +2651,59 @@
                 <w:lang w:eastAsia="pl-PL"/>
                 <w14:ligatures w14:val="none"/>
               </w:rPr>
-              <w:t>liczba rowerow publicznych na 100,000 ludnosciu 2024</w:t>
+              <w:t xml:space="preserve">liczba </w:t>
+            </w:r>
+            <w:proofErr w:type="spellStart"/>
+            <w:r>
+              <w:rPr>
+                <w:rFonts w:ascii="Calibri" w:eastAsia="Times New Roman" w:hAnsi="Calibri" w:cs="Calibri"/>
+                <w:color w:val="000000"/>
+                <w:kern w:val="0"/>
+                <w:sz w:val="18"/>
+                <w:szCs w:val="18"/>
+                <w:lang w:eastAsia="pl-PL"/>
+                <w14:ligatures w14:val="none"/>
+              </w:rPr>
+              <w:t>rowerow</w:t>
+            </w:r>
+            <w:proofErr w:type="spellEnd"/>
+            <w:r>
+              <w:rPr>
+                <w:rFonts w:ascii="Calibri" w:eastAsia="Times New Roman" w:hAnsi="Calibri" w:cs="Calibri"/>
+                <w:color w:val="000000"/>
+                <w:kern w:val="0"/>
+                <w:sz w:val="18"/>
+                <w:szCs w:val="18"/>
+                <w:lang w:eastAsia="pl-PL"/>
+                <w14:ligatures w14:val="none"/>
+              </w:rPr>
+              <w:t xml:space="preserve"> publicznych na 100,000 </w:t>
+            </w:r>
+            <w:proofErr w:type="spellStart"/>
+            <w:r>
+              <w:rPr>
+                <w:rFonts w:ascii="Calibri" w:eastAsia="Times New Roman" w:hAnsi="Calibri" w:cs="Calibri"/>
+                <w:color w:val="000000"/>
+                <w:kern w:val="0"/>
+                <w:sz w:val="18"/>
+                <w:szCs w:val="18"/>
+                <w:lang w:eastAsia="pl-PL"/>
+                <w14:ligatures w14:val="none"/>
+              </w:rPr>
+              <w:t>ludnosciu</w:t>
+            </w:r>
+            <w:proofErr w:type="spellEnd"/>
+            <w:r>
+              <w:rPr>
+                <w:rFonts w:ascii="Calibri" w:eastAsia="Times New Roman" w:hAnsi="Calibri" w:cs="Calibri"/>
+                <w:color w:val="000000"/>
+                <w:kern w:val="0"/>
+                <w:sz w:val="18"/>
+                <w:szCs w:val="18"/>
+                <w:lang w:eastAsia="pl-PL"/>
+                <w14:ligatures w14:val="none"/>
+              </w:rPr>
+              <w:t xml:space="preserve"> 2024</w:t>
             </w:r>
           </w:p>
         </w:tc>
@@ -2511,7 +2835,33 @@
                 <w:lang w:eastAsia="pl-PL"/>
                 <w14:ligatures w14:val="none"/>
               </w:rPr>
-              <w:t>drogi dla rowerow na 1,000 km2 2024</w:t>
+              <w:t xml:space="preserve">drogi dla </w:t>
+            </w:r>
+            <w:proofErr w:type="spellStart"/>
+            <w:r>
+              <w:rPr>
+                <w:rFonts w:ascii="Calibri" w:eastAsia="Times New Roman" w:hAnsi="Calibri" w:cs="Calibri"/>
+                <w:color w:val="000000"/>
+                <w:kern w:val="0"/>
+                <w:sz w:val="18"/>
+                <w:szCs w:val="18"/>
+                <w:lang w:eastAsia="pl-PL"/>
+                <w14:ligatures w14:val="none"/>
+              </w:rPr>
+              <w:t>rowerow</w:t>
+            </w:r>
+            <w:proofErr w:type="spellEnd"/>
+            <w:r>
+              <w:rPr>
+                <w:rFonts w:ascii="Calibri" w:eastAsia="Times New Roman" w:hAnsi="Calibri" w:cs="Calibri"/>
+                <w:color w:val="000000"/>
+                <w:kern w:val="0"/>
+                <w:sz w:val="18"/>
+                <w:szCs w:val="18"/>
+                <w:lang w:eastAsia="pl-PL"/>
+                <w14:ligatures w14:val="none"/>
+              </w:rPr>
+              <w:t xml:space="preserve"> na 1,000 km2 2024</w:t>
             </w:r>
           </w:p>
         </w:tc>
@@ -2643,7 +2993,85 @@
                 <w:lang w:eastAsia="pl-PL"/>
                 <w14:ligatures w14:val="none"/>
               </w:rPr>
-              <w:t>kilometry drog publiczncyh ogolem na 100 km^2 - 2024</w:t>
+              <w:t xml:space="preserve">kilometry </w:t>
+            </w:r>
+            <w:proofErr w:type="spellStart"/>
+            <w:r>
+              <w:rPr>
+                <w:rFonts w:ascii="Calibri" w:eastAsia="Times New Roman" w:hAnsi="Calibri" w:cs="Calibri"/>
+                <w:color w:val="000000"/>
+                <w:kern w:val="0"/>
+                <w:sz w:val="18"/>
+                <w:szCs w:val="18"/>
+                <w:lang w:eastAsia="pl-PL"/>
+                <w14:ligatures w14:val="none"/>
+              </w:rPr>
+              <w:t>drog</w:t>
+            </w:r>
+            <w:proofErr w:type="spellEnd"/>
+            <w:r>
+              <w:rPr>
+                <w:rFonts w:ascii="Calibri" w:eastAsia="Times New Roman" w:hAnsi="Calibri" w:cs="Calibri"/>
+                <w:color w:val="000000"/>
+                <w:kern w:val="0"/>
+                <w:sz w:val="18"/>
+                <w:szCs w:val="18"/>
+                <w:lang w:eastAsia="pl-PL"/>
+                <w14:ligatures w14:val="none"/>
+              </w:rPr>
+              <w:t xml:space="preserve"> </w:t>
+            </w:r>
+            <w:proofErr w:type="spellStart"/>
+            <w:r>
+              <w:rPr>
+                <w:rFonts w:ascii="Calibri" w:eastAsia="Times New Roman" w:hAnsi="Calibri" w:cs="Calibri"/>
+                <w:color w:val="000000"/>
+                <w:kern w:val="0"/>
+                <w:sz w:val="18"/>
+                <w:szCs w:val="18"/>
+                <w:lang w:eastAsia="pl-PL"/>
+                <w14:ligatures w14:val="none"/>
+              </w:rPr>
+              <w:t>publiczncyh</w:t>
+            </w:r>
+            <w:proofErr w:type="spellEnd"/>
+            <w:r>
+              <w:rPr>
+                <w:rFonts w:ascii="Calibri" w:eastAsia="Times New Roman" w:hAnsi="Calibri" w:cs="Calibri"/>
+                <w:color w:val="000000"/>
+                <w:kern w:val="0"/>
+                <w:sz w:val="18"/>
+                <w:szCs w:val="18"/>
+                <w:lang w:eastAsia="pl-PL"/>
+                <w14:ligatures w14:val="none"/>
+              </w:rPr>
+              <w:t xml:space="preserve"> </w:t>
+            </w:r>
+            <w:proofErr w:type="spellStart"/>
+            <w:r>
+              <w:rPr>
+                <w:rFonts w:ascii="Calibri" w:eastAsia="Times New Roman" w:hAnsi="Calibri" w:cs="Calibri"/>
+                <w:color w:val="000000"/>
+                <w:kern w:val="0"/>
+                <w:sz w:val="18"/>
+                <w:szCs w:val="18"/>
+                <w:lang w:eastAsia="pl-PL"/>
+                <w14:ligatures w14:val="none"/>
+              </w:rPr>
+              <w:t>ogolem</w:t>
+            </w:r>
+            <w:proofErr w:type="spellEnd"/>
+            <w:r>
+              <w:rPr>
+                <w:rFonts w:ascii="Calibri" w:eastAsia="Times New Roman" w:hAnsi="Calibri" w:cs="Calibri"/>
+                <w:color w:val="000000"/>
+                <w:kern w:val="0"/>
+                <w:sz w:val="18"/>
+                <w:szCs w:val="18"/>
+                <w:lang w:eastAsia="pl-PL"/>
+                <w14:ligatures w14:val="none"/>
+              </w:rPr>
+              <w:t xml:space="preserve"> na 100 km^2 - 2024</w:t>
             </w:r>
           </w:p>
         </w:tc>
@@ -2775,7 +3203,59 @@
                 <w:lang w:eastAsia="pl-PL"/>
                 <w14:ligatures w14:val="none"/>
               </w:rPr>
-              <w:t>kilometry drog publiczncyh o nawierzchni twardej na 100 km^2 - 2024</w:t>
+              <w:t xml:space="preserve">kilometry </w:t>
+            </w:r>
+            <w:proofErr w:type="spellStart"/>
+            <w:r>
+              <w:rPr>
+                <w:rFonts w:ascii="Calibri" w:eastAsia="Times New Roman" w:hAnsi="Calibri" w:cs="Calibri"/>
+                <w:color w:val="000000"/>
+                <w:kern w:val="0"/>
+                <w:sz w:val="18"/>
+                <w:szCs w:val="18"/>
+                <w:lang w:eastAsia="pl-PL"/>
+                <w14:ligatures w14:val="none"/>
+              </w:rPr>
+              <w:t>drog</w:t>
+            </w:r>
+            <w:proofErr w:type="spellEnd"/>
+            <w:r>
+              <w:rPr>
+                <w:rFonts w:ascii="Calibri" w:eastAsia="Times New Roman" w:hAnsi="Calibri" w:cs="Calibri"/>
+                <w:color w:val="000000"/>
+                <w:kern w:val="0"/>
+                <w:sz w:val="18"/>
+                <w:szCs w:val="18"/>
+                <w:lang w:eastAsia="pl-PL"/>
+                <w14:ligatures w14:val="none"/>
+              </w:rPr>
+              <w:t xml:space="preserve"> </w:t>
+            </w:r>
+            <w:proofErr w:type="spellStart"/>
+            <w:r>
+              <w:rPr>
+                <w:rFonts w:ascii="Calibri" w:eastAsia="Times New Roman" w:hAnsi="Calibri" w:cs="Calibri"/>
+                <w:color w:val="000000"/>
+                <w:kern w:val="0"/>
+                <w:sz w:val="18"/>
+                <w:szCs w:val="18"/>
+                <w:lang w:eastAsia="pl-PL"/>
+                <w14:ligatures w14:val="none"/>
+              </w:rPr>
+              <w:t>publiczncyh</w:t>
+            </w:r>
+            <w:proofErr w:type="spellEnd"/>
+            <w:r>
+              <w:rPr>
+                <w:rFonts w:ascii="Calibri" w:eastAsia="Times New Roman" w:hAnsi="Calibri" w:cs="Calibri"/>
+                <w:color w:val="000000"/>
+                <w:kern w:val="0"/>
+                <w:sz w:val="18"/>
+                <w:szCs w:val="18"/>
+                <w:lang w:eastAsia="pl-PL"/>
+                <w14:ligatures w14:val="none"/>
+              </w:rPr>
+              <w:t xml:space="preserve"> o nawierzchni twardej na 100 km^2 - 2024</w:t>
             </w:r>
           </w:p>
         </w:tc>
@@ -2907,8 +3387,22 @@
                 <w:lang w:eastAsia="pl-PL"/>
                 <w14:ligatures w14:val="none"/>
               </w:rPr>
-              <w:t>(przystanki autobusowe (z trolejbusowymi) i tramwajowe, przystanki wspólne dla tramwajów i autobusów) na 100km^2 w  2024</w:t>
-            </w:r>
+              <w:t xml:space="preserve">(przystanki autobusowe (z trolejbusowymi) i tramwajowe, przystanki wspólne dla tramwajów i autobusów) na 100km^2 </w:t>
+            </w:r>
+            <w:proofErr w:type="gramStart"/>
+            <w:r>
+              <w:rPr>
+                <w:rFonts w:ascii="Calibri" w:eastAsia="Times New Roman" w:hAnsi="Calibri" w:cs="Calibri"/>
+                <w:color w:val="000000"/>
+                <w:kern w:val="0"/>
+                <w:sz w:val="18"/>
+                <w:szCs w:val="18"/>
+                <w:lang w:eastAsia="pl-PL"/>
+                <w14:ligatures w14:val="none"/>
+              </w:rPr>
+              <w:t>w  2024</w:t>
+            </w:r>
+            <w:proofErr w:type="gramEnd"/>
           </w:p>
         </w:tc>
       </w:tr>
@@ -3303,7 +3797,33 @@
                 <w:lang w:eastAsia="pl-PL"/>
                 <w14:ligatures w14:val="none"/>
               </w:rPr>
-              <w:t>LINIE REGULARNEJ KOMUNIKACJI AUTOBUSOWEJ  w km na 100km^2 w 2024</w:t>
+              <w:t xml:space="preserve">LINIE REGULARNEJ KOMUNIKACJI </w:t>
+            </w:r>
+            <w:proofErr w:type="gramStart"/>
+            <w:r>
+              <w:rPr>
+                <w:rFonts w:ascii="Calibri" w:eastAsia="Times New Roman" w:hAnsi="Calibri" w:cs="Calibri"/>
+                <w:color w:val="000000"/>
+                <w:kern w:val="0"/>
+                <w:sz w:val="18"/>
+                <w:szCs w:val="18"/>
+                <w:lang w:eastAsia="pl-PL"/>
+                <w14:ligatures w14:val="none"/>
+              </w:rPr>
+              <w:t>AUTOBUSOWEJ  w</w:t>
+            </w:r>
+            <w:proofErr w:type="gramEnd"/>
+            <w:r>
+              <w:rPr>
+                <w:rFonts w:ascii="Calibri" w:eastAsia="Times New Roman" w:hAnsi="Calibri" w:cs="Calibri"/>
+                <w:color w:val="000000"/>
+                <w:kern w:val="0"/>
+                <w:sz w:val="18"/>
+                <w:szCs w:val="18"/>
+                <w:lang w:eastAsia="pl-PL"/>
+                <w14:ligatures w14:val="none"/>
+              </w:rPr>
+              <w:t xml:space="preserve"> km na 100km^2 w 2024</w:t>
             </w:r>
           </w:p>
         </w:tc>
@@ -3567,7 +4087,33 @@
                 <w:lang w:eastAsia="pl-PL"/>
                 <w14:ligatures w14:val="none"/>
               </w:rPr>
-              <w:t>samochody osobowe na 100 mieszkancow 2024</w:t>
+              <w:t xml:space="preserve">samochody osobowe na 100 </w:t>
+            </w:r>
+            <w:proofErr w:type="spellStart"/>
+            <w:r>
+              <w:rPr>
+                <w:rFonts w:ascii="Calibri" w:eastAsia="Times New Roman" w:hAnsi="Calibri" w:cs="Calibri"/>
+                <w:color w:val="000000"/>
+                <w:kern w:val="0"/>
+                <w:sz w:val="18"/>
+                <w:szCs w:val="18"/>
+                <w:lang w:eastAsia="pl-PL"/>
+                <w14:ligatures w14:val="none"/>
+              </w:rPr>
+              <w:t>mieszkancow</w:t>
+            </w:r>
+            <w:proofErr w:type="spellEnd"/>
+            <w:r>
+              <w:rPr>
+                <w:rFonts w:ascii="Calibri" w:eastAsia="Times New Roman" w:hAnsi="Calibri" w:cs="Calibri"/>
+                <w:color w:val="000000"/>
+                <w:kern w:val="0"/>
+                <w:sz w:val="18"/>
+                <w:szCs w:val="18"/>
+                <w:lang w:eastAsia="pl-PL"/>
+                <w14:ligatures w14:val="none"/>
+              </w:rPr>
+              <w:t xml:space="preserve"> 2024</w:t>
             </w:r>
           </w:p>
         </w:tc>
@@ -3699,7 +4245,33 @@
                 <w:lang w:eastAsia="pl-PL"/>
                 <w14:ligatures w14:val="none"/>
               </w:rPr>
-              <w:t>wypadki drogowe na 100,000 mieszkancow 2024</w:t>
+              <w:t xml:space="preserve">wypadki drogowe na 100,000 </w:t>
+            </w:r>
+            <w:proofErr w:type="spellStart"/>
+            <w:r>
+              <w:rPr>
+                <w:rFonts w:ascii="Calibri" w:eastAsia="Times New Roman" w:hAnsi="Calibri" w:cs="Calibri"/>
+                <w:color w:val="000000"/>
+                <w:kern w:val="0"/>
+                <w:sz w:val="18"/>
+                <w:szCs w:val="18"/>
+                <w:lang w:eastAsia="pl-PL"/>
+                <w14:ligatures w14:val="none"/>
+              </w:rPr>
+              <w:t>mieszkancow</w:t>
+            </w:r>
+            <w:proofErr w:type="spellEnd"/>
+            <w:r>
+              <w:rPr>
+                <w:rFonts w:ascii="Calibri" w:eastAsia="Times New Roman" w:hAnsi="Calibri" w:cs="Calibri"/>
+                <w:color w:val="000000"/>
+                <w:kern w:val="0"/>
+                <w:sz w:val="18"/>
+                <w:szCs w:val="18"/>
+                <w:lang w:eastAsia="pl-PL"/>
+                <w14:ligatures w14:val="none"/>
+              </w:rPr>
+              <w:t xml:space="preserve"> 2024</w:t>
             </w:r>
           </w:p>
         </w:tc>
@@ -3963,7 +4535,33 @@
                 <w:lang w:eastAsia="pl-PL"/>
                 <w14:ligatures w14:val="none"/>
               </w:rPr>
-              <w:t>WYDATKI BUDŻETÓW GMIN I MIAST NA PRAWACH POWIATU na 1 mieszkanca w 2024 w setkach zł</w:t>
+              <w:t xml:space="preserve">WYDATKI BUDŻETÓW GMIN I MIAST NA PRAWACH POWIATU na 1 </w:t>
+            </w:r>
+            <w:proofErr w:type="spellStart"/>
+            <w:r>
+              <w:rPr>
+                <w:rFonts w:ascii="Calibri" w:eastAsia="Times New Roman" w:hAnsi="Calibri" w:cs="Calibri"/>
+                <w:color w:val="000000"/>
+                <w:kern w:val="0"/>
+                <w:sz w:val="18"/>
+                <w:szCs w:val="18"/>
+                <w:lang w:eastAsia="pl-PL"/>
+                <w14:ligatures w14:val="none"/>
+              </w:rPr>
+              <w:t>mieszkanca</w:t>
+            </w:r>
+            <w:proofErr w:type="spellEnd"/>
+            <w:r>
+              <w:rPr>
+                <w:rFonts w:ascii="Calibri" w:eastAsia="Times New Roman" w:hAnsi="Calibri" w:cs="Calibri"/>
+                <w:color w:val="000000"/>
+                <w:kern w:val="0"/>
+                <w:sz w:val="18"/>
+                <w:szCs w:val="18"/>
+                <w:lang w:eastAsia="pl-PL"/>
+                <w14:ligatures w14:val="none"/>
+              </w:rPr>
+              <w:t xml:space="preserve"> w 2024 w setkach zł</w:t>
             </w:r>
           </w:p>
         </w:tc>
@@ -4095,7 +4693,59 @@
                 <w:lang w:eastAsia="pl-PL"/>
                 <w14:ligatures w14:val="none"/>
               </w:rPr>
-              <w:t>Wydatki budzetów gmin I miast na prawach powiatu na kulturę I ochronę dziedzictwa narodowego na 1 mieszkanca w 2024 w dziesiątkach złotych</w:t>
+              <w:t xml:space="preserve">Wydatki </w:t>
+            </w:r>
+            <w:proofErr w:type="spellStart"/>
+            <w:r>
+              <w:rPr>
+                <w:rFonts w:ascii="Calibri" w:eastAsia="Times New Roman" w:hAnsi="Calibri" w:cs="Calibri"/>
+                <w:color w:val="000000"/>
+                <w:kern w:val="0"/>
+                <w:sz w:val="18"/>
+                <w:szCs w:val="18"/>
+                <w:lang w:eastAsia="pl-PL"/>
+                <w14:ligatures w14:val="none"/>
+              </w:rPr>
+              <w:t>budzetów</w:t>
+            </w:r>
+            <w:proofErr w:type="spellEnd"/>
+            <w:r>
+              <w:rPr>
+                <w:rFonts w:ascii="Calibri" w:eastAsia="Times New Roman" w:hAnsi="Calibri" w:cs="Calibri"/>
+                <w:color w:val="000000"/>
+                <w:kern w:val="0"/>
+                <w:sz w:val="18"/>
+                <w:szCs w:val="18"/>
+                <w:lang w:eastAsia="pl-PL"/>
+                <w14:ligatures w14:val="none"/>
+              </w:rPr>
+              <w:t xml:space="preserve"> gmin I miast na prawach powiatu na kulturę I ochronę dziedzictwa narodowego na 1 </w:t>
+            </w:r>
+            <w:proofErr w:type="spellStart"/>
+            <w:r>
+              <w:rPr>
+                <w:rFonts w:ascii="Calibri" w:eastAsia="Times New Roman" w:hAnsi="Calibri" w:cs="Calibri"/>
+                <w:color w:val="000000"/>
+                <w:kern w:val="0"/>
+                <w:sz w:val="18"/>
+                <w:szCs w:val="18"/>
+                <w:lang w:eastAsia="pl-PL"/>
+                <w14:ligatures w14:val="none"/>
+              </w:rPr>
+              <w:t>mieszkanca</w:t>
+            </w:r>
+            <w:proofErr w:type="spellEnd"/>
+            <w:r>
+              <w:rPr>
+                <w:rFonts w:ascii="Calibri" w:eastAsia="Times New Roman" w:hAnsi="Calibri" w:cs="Calibri"/>
+                <w:color w:val="000000"/>
+                <w:kern w:val="0"/>
+                <w:sz w:val="18"/>
+                <w:szCs w:val="18"/>
+                <w:lang w:eastAsia="pl-PL"/>
+                <w14:ligatures w14:val="none"/>
+              </w:rPr>
+              <w:t xml:space="preserve"> w 2024 w dziesiątkach złotych</w:t>
             </w:r>
           </w:p>
         </w:tc>
@@ -4227,7 +4877,85 @@
                 <w:lang w:eastAsia="pl-PL"/>
                 <w14:ligatures w14:val="none"/>
               </w:rPr>
-              <w:t>Wydatki budzetów gmin I miast na prawach powiatu na oświatena 1 mieszkanca w 2024 w setkach zł</w:t>
+              <w:t xml:space="preserve">Wydatki </w:t>
+            </w:r>
+            <w:proofErr w:type="spellStart"/>
+            <w:r>
+              <w:rPr>
+                <w:rFonts w:ascii="Calibri" w:eastAsia="Times New Roman" w:hAnsi="Calibri" w:cs="Calibri"/>
+                <w:color w:val="000000"/>
+                <w:kern w:val="0"/>
+                <w:sz w:val="18"/>
+                <w:szCs w:val="18"/>
+                <w:lang w:eastAsia="pl-PL"/>
+                <w14:ligatures w14:val="none"/>
+              </w:rPr>
+              <w:t>budzetów</w:t>
+            </w:r>
+            <w:proofErr w:type="spellEnd"/>
+            <w:r>
+              <w:rPr>
+                <w:rFonts w:ascii="Calibri" w:eastAsia="Times New Roman" w:hAnsi="Calibri" w:cs="Calibri"/>
+                <w:color w:val="000000"/>
+                <w:kern w:val="0"/>
+                <w:sz w:val="18"/>
+                <w:szCs w:val="18"/>
+                <w:lang w:eastAsia="pl-PL"/>
+                <w14:ligatures w14:val="none"/>
+              </w:rPr>
+              <w:t xml:space="preserve"> gmin I miast na prawach powiatu na </w:t>
+            </w:r>
+            <w:proofErr w:type="spellStart"/>
+            <w:r>
+              <w:rPr>
+                <w:rFonts w:ascii="Calibri" w:eastAsia="Times New Roman" w:hAnsi="Calibri" w:cs="Calibri"/>
+                <w:color w:val="000000"/>
+                <w:kern w:val="0"/>
+                <w:sz w:val="18"/>
+                <w:szCs w:val="18"/>
+                <w:lang w:eastAsia="pl-PL"/>
+                <w14:ligatures w14:val="none"/>
+              </w:rPr>
+              <w:t>oświatena</w:t>
+            </w:r>
+            <w:proofErr w:type="spellEnd"/>
+            <w:r>
+              <w:rPr>
+                <w:rFonts w:ascii="Calibri" w:eastAsia="Times New Roman" w:hAnsi="Calibri" w:cs="Calibri"/>
+                <w:color w:val="000000"/>
+                <w:kern w:val="0"/>
+                <w:sz w:val="18"/>
+                <w:szCs w:val="18"/>
+                <w:lang w:eastAsia="pl-PL"/>
+                <w14:ligatures w14:val="none"/>
+              </w:rPr>
+              <w:t xml:space="preserve"> 1 </w:t>
+            </w:r>
+            <w:proofErr w:type="spellStart"/>
+            <w:r>
+              <w:rPr>
+                <w:rFonts w:ascii="Calibri" w:eastAsia="Times New Roman" w:hAnsi="Calibri" w:cs="Calibri"/>
+                <w:color w:val="000000"/>
+                <w:kern w:val="0"/>
+                <w:sz w:val="18"/>
+                <w:szCs w:val="18"/>
+                <w:lang w:eastAsia="pl-PL"/>
+                <w14:ligatures w14:val="none"/>
+              </w:rPr>
+              <w:t>mieszkanca</w:t>
+            </w:r>
+            <w:proofErr w:type="spellEnd"/>
+            <w:r>
+              <w:rPr>
+                <w:rFonts w:ascii="Calibri" w:eastAsia="Times New Roman" w:hAnsi="Calibri" w:cs="Calibri"/>
+                <w:color w:val="000000"/>
+                <w:kern w:val="0"/>
+                <w:sz w:val="18"/>
+                <w:szCs w:val="18"/>
+                <w:lang w:eastAsia="pl-PL"/>
+                <w14:ligatures w14:val="none"/>
+              </w:rPr>
+              <w:t xml:space="preserve"> w 2024 w setkach zł</w:t>
             </w:r>
           </w:p>
         </w:tc>
@@ -4359,7 +5087,59 @@
                 <w:lang w:eastAsia="pl-PL"/>
                 <w14:ligatures w14:val="none"/>
               </w:rPr>
-              <w:t>wydatki budzetów gmin I miast na prawach powiatu na Ochrona powietrza atmosferycznego i klimatu na 1 mieszkanca w 2024</w:t>
+              <w:t xml:space="preserve">wydatki </w:t>
+            </w:r>
+            <w:proofErr w:type="spellStart"/>
+            <w:r>
+              <w:rPr>
+                <w:rFonts w:ascii="Calibri" w:eastAsia="Times New Roman" w:hAnsi="Calibri" w:cs="Calibri"/>
+                <w:color w:val="000000"/>
+                <w:kern w:val="0"/>
+                <w:sz w:val="18"/>
+                <w:szCs w:val="18"/>
+                <w:lang w:eastAsia="pl-PL"/>
+                <w14:ligatures w14:val="none"/>
+              </w:rPr>
+              <w:t>budzetów</w:t>
+            </w:r>
+            <w:proofErr w:type="spellEnd"/>
+            <w:r>
+              <w:rPr>
+                <w:rFonts w:ascii="Calibri" w:eastAsia="Times New Roman" w:hAnsi="Calibri" w:cs="Calibri"/>
+                <w:color w:val="000000"/>
+                <w:kern w:val="0"/>
+                <w:sz w:val="18"/>
+                <w:szCs w:val="18"/>
+                <w:lang w:eastAsia="pl-PL"/>
+                <w14:ligatures w14:val="none"/>
+              </w:rPr>
+              <w:t xml:space="preserve"> gmin I miast na prawach powiatu na Ochrona powietrza atmosferycznego i klimatu na 1 </w:t>
+            </w:r>
+            <w:proofErr w:type="spellStart"/>
+            <w:r>
+              <w:rPr>
+                <w:rFonts w:ascii="Calibri" w:eastAsia="Times New Roman" w:hAnsi="Calibri" w:cs="Calibri"/>
+                <w:color w:val="000000"/>
+                <w:kern w:val="0"/>
+                <w:sz w:val="18"/>
+                <w:szCs w:val="18"/>
+                <w:lang w:eastAsia="pl-PL"/>
+                <w14:ligatures w14:val="none"/>
+              </w:rPr>
+              <w:t>mieszkanca</w:t>
+            </w:r>
+            <w:proofErr w:type="spellEnd"/>
+            <w:r>
+              <w:rPr>
+                <w:rFonts w:ascii="Calibri" w:eastAsia="Times New Roman" w:hAnsi="Calibri" w:cs="Calibri"/>
+                <w:color w:val="000000"/>
+                <w:kern w:val="0"/>
+                <w:sz w:val="18"/>
+                <w:szCs w:val="18"/>
+                <w:lang w:eastAsia="pl-PL"/>
+                <w14:ligatures w14:val="none"/>
+              </w:rPr>
+              <w:t xml:space="preserve"> w 2024</w:t>
             </w:r>
           </w:p>
         </w:tc>
@@ -4491,7 +5271,59 @@
                 <w:lang w:eastAsia="pl-PL"/>
                 <w14:ligatures w14:val="none"/>
               </w:rPr>
-              <w:t>wydatki inwestycyjne budzetów gmin I miast na prawach powiatu na 1 mieszkanca w 2024 w setkach zł</w:t>
+              <w:t xml:space="preserve">wydatki inwestycyjne </w:t>
+            </w:r>
+            <w:proofErr w:type="spellStart"/>
+            <w:r>
+              <w:rPr>
+                <w:rFonts w:ascii="Calibri" w:eastAsia="Times New Roman" w:hAnsi="Calibri" w:cs="Calibri"/>
+                <w:color w:val="000000"/>
+                <w:kern w:val="0"/>
+                <w:sz w:val="18"/>
+                <w:szCs w:val="18"/>
+                <w:lang w:eastAsia="pl-PL"/>
+                <w14:ligatures w14:val="none"/>
+              </w:rPr>
+              <w:t>budzetów</w:t>
+            </w:r>
+            <w:proofErr w:type="spellEnd"/>
+            <w:r>
+              <w:rPr>
+                <w:rFonts w:ascii="Calibri" w:eastAsia="Times New Roman" w:hAnsi="Calibri" w:cs="Calibri"/>
+                <w:color w:val="000000"/>
+                <w:kern w:val="0"/>
+                <w:sz w:val="18"/>
+                <w:szCs w:val="18"/>
+                <w:lang w:eastAsia="pl-PL"/>
+                <w14:ligatures w14:val="none"/>
+              </w:rPr>
+              <w:t xml:space="preserve"> gmin I miast na prawach powiatu na 1 </w:t>
+            </w:r>
+            <w:proofErr w:type="spellStart"/>
+            <w:r>
+              <w:rPr>
+                <w:rFonts w:ascii="Calibri" w:eastAsia="Times New Roman" w:hAnsi="Calibri" w:cs="Calibri"/>
+                <w:color w:val="000000"/>
+                <w:kern w:val="0"/>
+                <w:sz w:val="18"/>
+                <w:szCs w:val="18"/>
+                <w:lang w:eastAsia="pl-PL"/>
+                <w14:ligatures w14:val="none"/>
+              </w:rPr>
+              <w:t>mieszkanca</w:t>
+            </w:r>
+            <w:proofErr w:type="spellEnd"/>
+            <w:r>
+              <w:rPr>
+                <w:rFonts w:ascii="Calibri" w:eastAsia="Times New Roman" w:hAnsi="Calibri" w:cs="Calibri"/>
+                <w:color w:val="000000"/>
+                <w:kern w:val="0"/>
+                <w:sz w:val="18"/>
+                <w:szCs w:val="18"/>
+                <w:lang w:eastAsia="pl-PL"/>
+                <w14:ligatures w14:val="none"/>
+              </w:rPr>
+              <w:t xml:space="preserve"> w 2024 w setkach zł</w:t>
             </w:r>
           </w:p>
         </w:tc>
@@ -5416,7 +6248,33 @@
                 <w:lang w:eastAsia="pl-PL"/>
                 <w14:ligatures w14:val="none"/>
               </w:rPr>
-              <w:t>Lekarze dentyści pracujący bezpośrednio z pacjentem według województw – na 10 tys Mieszkańców – stan 31 grudnia 2023</w:t>
+              <w:t xml:space="preserve">Lekarze dentyści pracujący bezpośrednio z pacjentem według województw – na 10 </w:t>
+            </w:r>
+            <w:proofErr w:type="spellStart"/>
+            <w:r>
+              <w:rPr>
+                <w:rFonts w:ascii="Calibri" w:eastAsia="Times New Roman" w:hAnsi="Calibri" w:cs="Calibri"/>
+                <w:color w:val="000000"/>
+                <w:kern w:val="0"/>
+                <w:sz w:val="18"/>
+                <w:szCs w:val="18"/>
+                <w:lang w:eastAsia="pl-PL"/>
+                <w14:ligatures w14:val="none"/>
+              </w:rPr>
+              <w:t>tys</w:t>
+            </w:r>
+            <w:proofErr w:type="spellEnd"/>
+            <w:r>
+              <w:rPr>
+                <w:rFonts w:ascii="Calibri" w:eastAsia="Times New Roman" w:hAnsi="Calibri" w:cs="Calibri"/>
+                <w:color w:val="000000"/>
+                <w:kern w:val="0"/>
+                <w:sz w:val="18"/>
+                <w:szCs w:val="18"/>
+                <w:lang w:eastAsia="pl-PL"/>
+                <w14:ligatures w14:val="none"/>
+              </w:rPr>
+              <w:t xml:space="preserve"> Mieszkańców – stan 31 grudnia 2023</w:t>
             </w:r>
           </w:p>
         </w:tc>
@@ -5548,7 +6406,33 @@
                 <w:lang w:eastAsia="pl-PL"/>
                 <w14:ligatures w14:val="none"/>
               </w:rPr>
-              <w:t>Pielęgniarki pracujące bezpośrednio z pacjentem według województw na 10 tys mieszkańców – 31 grudnia 2023</w:t>
+              <w:t xml:space="preserve">Pielęgniarki pracujące bezpośrednio z pacjentem według województw na 10 </w:t>
+            </w:r>
+            <w:proofErr w:type="spellStart"/>
+            <w:r>
+              <w:rPr>
+                <w:rFonts w:ascii="Calibri" w:eastAsia="Times New Roman" w:hAnsi="Calibri" w:cs="Calibri"/>
+                <w:color w:val="000000"/>
+                <w:kern w:val="0"/>
+                <w:sz w:val="18"/>
+                <w:szCs w:val="18"/>
+                <w:lang w:eastAsia="pl-PL"/>
+                <w14:ligatures w14:val="none"/>
+              </w:rPr>
+              <w:t>tys</w:t>
+            </w:r>
+            <w:proofErr w:type="spellEnd"/>
+            <w:r>
+              <w:rPr>
+                <w:rFonts w:ascii="Calibri" w:eastAsia="Times New Roman" w:hAnsi="Calibri" w:cs="Calibri"/>
+                <w:color w:val="000000"/>
+                <w:kern w:val="0"/>
+                <w:sz w:val="18"/>
+                <w:szCs w:val="18"/>
+                <w:lang w:eastAsia="pl-PL"/>
+                <w14:ligatures w14:val="none"/>
+              </w:rPr>
+              <w:t xml:space="preserve"> mieszkańców – 31 grudnia 2023</w:t>
             </w:r>
           </w:p>
         </w:tc>
@@ -6208,7 +7092,33 @@
                 <w:lang w:eastAsia="pl-PL"/>
                 <w14:ligatures w14:val="none"/>
               </w:rPr>
-              <w:t>miejsca noclegowe na 1000 ludnosci w 2024</w:t>
+              <w:t xml:space="preserve">miejsca noclegowe na 1000 </w:t>
+            </w:r>
+            <w:proofErr w:type="spellStart"/>
+            <w:r>
+              <w:rPr>
+                <w:rFonts w:ascii="Calibri" w:eastAsia="Times New Roman" w:hAnsi="Calibri" w:cs="Calibri"/>
+                <w:color w:val="000000"/>
+                <w:kern w:val="0"/>
+                <w:sz w:val="18"/>
+                <w:szCs w:val="18"/>
+                <w:lang w:eastAsia="pl-PL"/>
+                <w14:ligatures w14:val="none"/>
+              </w:rPr>
+              <w:t>ludnosci</w:t>
+            </w:r>
+            <w:proofErr w:type="spellEnd"/>
+            <w:r>
+              <w:rPr>
+                <w:rFonts w:ascii="Calibri" w:eastAsia="Times New Roman" w:hAnsi="Calibri" w:cs="Calibri"/>
+                <w:color w:val="000000"/>
+                <w:kern w:val="0"/>
+                <w:sz w:val="18"/>
+                <w:szCs w:val="18"/>
+                <w:lang w:eastAsia="pl-PL"/>
+                <w14:ligatures w14:val="none"/>
+              </w:rPr>
+              <w:t xml:space="preserve"> w 2024</w:t>
             </w:r>
           </w:p>
         </w:tc>
@@ -6604,7 +7514,33 @@
                 <w:lang w:eastAsia="pl-PL"/>
                 <w14:ligatures w14:val="none"/>
               </w:rPr>
-              <w:t>Odsetek ludności w obiektach  zbiorowego zakwaterowania 2021 / powiększone 100-krotnie</w:t>
+              <w:t xml:space="preserve">Odsetek ludności w </w:t>
+            </w:r>
+            <w:proofErr w:type="gramStart"/>
+            <w:r>
+              <w:rPr>
+                <w:rFonts w:ascii="Calibri" w:eastAsia="Times New Roman" w:hAnsi="Calibri" w:cs="Calibri"/>
+                <w:color w:val="000000"/>
+                <w:kern w:val="0"/>
+                <w:sz w:val="18"/>
+                <w:szCs w:val="18"/>
+                <w:lang w:eastAsia="pl-PL"/>
+                <w14:ligatures w14:val="none"/>
+              </w:rPr>
+              <w:t>obiektach  zbiorowego</w:t>
+            </w:r>
+            <w:proofErr w:type="gramEnd"/>
+            <w:r>
+              <w:rPr>
+                <w:rFonts w:ascii="Calibri" w:eastAsia="Times New Roman" w:hAnsi="Calibri" w:cs="Calibri"/>
+                <w:color w:val="000000"/>
+                <w:kern w:val="0"/>
+                <w:sz w:val="18"/>
+                <w:szCs w:val="18"/>
+                <w:lang w:eastAsia="pl-PL"/>
+                <w14:ligatures w14:val="none"/>
+              </w:rPr>
+              <w:t xml:space="preserve"> zakwaterowania 2021 / powiększone 100-krotnie</w:t>
             </w:r>
           </w:p>
         </w:tc>
@@ -6736,7 +7672,85 @@
                 <w:lang w:eastAsia="pl-PL"/>
                 <w14:ligatures w14:val="none"/>
               </w:rPr>
-              <w:t>liczba miejsc w domach studenckich w stosunku do liczby studentow 2024 - jaki odsetek studentow domy domy studenckie są w stanie pomieścić</w:t>
+              <w:t xml:space="preserve">liczba miejsc w domach studenckich w stosunku do liczby </w:t>
+            </w:r>
+            <w:proofErr w:type="spellStart"/>
+            <w:r>
+              <w:rPr>
+                <w:rFonts w:ascii="Calibri" w:eastAsia="Times New Roman" w:hAnsi="Calibri" w:cs="Calibri"/>
+                <w:color w:val="000000"/>
+                <w:kern w:val="0"/>
+                <w:sz w:val="18"/>
+                <w:szCs w:val="18"/>
+                <w:lang w:eastAsia="pl-PL"/>
+                <w14:ligatures w14:val="none"/>
+              </w:rPr>
+              <w:t>studentow</w:t>
+            </w:r>
+            <w:proofErr w:type="spellEnd"/>
+            <w:r>
+              <w:rPr>
+                <w:rFonts w:ascii="Calibri" w:eastAsia="Times New Roman" w:hAnsi="Calibri" w:cs="Calibri"/>
+                <w:color w:val="000000"/>
+                <w:kern w:val="0"/>
+                <w:sz w:val="18"/>
+                <w:szCs w:val="18"/>
+                <w:lang w:eastAsia="pl-PL"/>
+                <w14:ligatures w14:val="none"/>
+              </w:rPr>
+              <w:t xml:space="preserve"> 2024 - jaki odsetek </w:t>
+            </w:r>
+            <w:proofErr w:type="spellStart"/>
+            <w:r>
+              <w:rPr>
+                <w:rFonts w:ascii="Calibri" w:eastAsia="Times New Roman" w:hAnsi="Calibri" w:cs="Calibri"/>
+                <w:color w:val="000000"/>
+                <w:kern w:val="0"/>
+                <w:sz w:val="18"/>
+                <w:szCs w:val="18"/>
+                <w:lang w:eastAsia="pl-PL"/>
+                <w14:ligatures w14:val="none"/>
+              </w:rPr>
+              <w:t>studentow</w:t>
+            </w:r>
+            <w:proofErr w:type="spellEnd"/>
+            <w:r>
+              <w:rPr>
+                <w:rFonts w:ascii="Calibri" w:eastAsia="Times New Roman" w:hAnsi="Calibri" w:cs="Calibri"/>
+                <w:color w:val="000000"/>
+                <w:kern w:val="0"/>
+                <w:sz w:val="18"/>
+                <w:szCs w:val="18"/>
+                <w:lang w:eastAsia="pl-PL"/>
+                <w14:ligatures w14:val="none"/>
+              </w:rPr>
+              <w:t xml:space="preserve"> domy </w:t>
+            </w:r>
+            <w:proofErr w:type="spellStart"/>
+            <w:r>
+              <w:rPr>
+                <w:rFonts w:ascii="Calibri" w:eastAsia="Times New Roman" w:hAnsi="Calibri" w:cs="Calibri"/>
+                <w:color w:val="000000"/>
+                <w:kern w:val="0"/>
+                <w:sz w:val="18"/>
+                <w:szCs w:val="18"/>
+                <w:lang w:eastAsia="pl-PL"/>
+                <w14:ligatures w14:val="none"/>
+              </w:rPr>
+              <w:t>domy</w:t>
+            </w:r>
+            <w:proofErr w:type="spellEnd"/>
+            <w:r>
+              <w:rPr>
+                <w:rFonts w:ascii="Calibri" w:eastAsia="Times New Roman" w:hAnsi="Calibri" w:cs="Calibri"/>
+                <w:color w:val="000000"/>
+                <w:kern w:val="0"/>
+                <w:sz w:val="18"/>
+                <w:szCs w:val="18"/>
+                <w:lang w:eastAsia="pl-PL"/>
+                <w14:ligatures w14:val="none"/>
+              </w:rPr>
+              <w:t xml:space="preserve"> studenckie są w stanie pomieścić</w:t>
             </w:r>
           </w:p>
         </w:tc>
@@ -7000,8 +8014,48 @@
                 <w:lang w:eastAsia="pl-PL"/>
                 <w14:ligatures w14:val="none"/>
               </w:rPr>
-              <w:t>zasoby mieszkaniowe gim komunalne 2024 na 10,000 mieszkancow</w:t>
-            </w:r>
+              <w:t xml:space="preserve">zasoby mieszkaniowe </w:t>
+            </w:r>
+            <w:proofErr w:type="spellStart"/>
+            <w:r>
+              <w:rPr>
+                <w:rFonts w:ascii="Calibri" w:eastAsia="Times New Roman" w:hAnsi="Calibri" w:cs="Calibri"/>
+                <w:color w:val="000000"/>
+                <w:kern w:val="0"/>
+                <w:sz w:val="18"/>
+                <w:szCs w:val="18"/>
+                <w:lang w:eastAsia="pl-PL"/>
+                <w14:ligatures w14:val="none"/>
+              </w:rPr>
+              <w:t>gim</w:t>
+            </w:r>
+            <w:proofErr w:type="spellEnd"/>
+            <w:r>
+              <w:rPr>
+                <w:rFonts w:ascii="Calibri" w:eastAsia="Times New Roman" w:hAnsi="Calibri" w:cs="Calibri"/>
+                <w:color w:val="000000"/>
+                <w:kern w:val="0"/>
+                <w:sz w:val="18"/>
+                <w:szCs w:val="18"/>
+                <w:lang w:eastAsia="pl-PL"/>
+                <w14:ligatures w14:val="none"/>
+              </w:rPr>
+              <w:t xml:space="preserve"> komunalne 2024 na 10,000 </w:t>
+            </w:r>
+            <w:proofErr w:type="spellStart"/>
+            <w:r>
+              <w:rPr>
+                <w:rFonts w:ascii="Calibri" w:eastAsia="Times New Roman" w:hAnsi="Calibri" w:cs="Calibri"/>
+                <w:color w:val="000000"/>
+                <w:kern w:val="0"/>
+                <w:sz w:val="18"/>
+                <w:szCs w:val="18"/>
+                <w:lang w:eastAsia="pl-PL"/>
+                <w14:ligatures w14:val="none"/>
+              </w:rPr>
+              <w:t>mieszkancow</w:t>
+            </w:r>
+            <w:proofErr w:type="spellEnd"/>
           </w:p>
         </w:tc>
       </w:tr>
@@ -7264,8 +8318,48 @@
                 <w:lang w:eastAsia="pl-PL"/>
                 <w14:ligatures w14:val="none"/>
               </w:rPr>
-              <w:t>odsetek ludnosci w wieku produkcyjnym - 2021 sp</w:t>
-            </w:r>
+              <w:t xml:space="preserve">odsetek </w:t>
+            </w:r>
+            <w:proofErr w:type="spellStart"/>
+            <w:r>
+              <w:rPr>
+                <w:rFonts w:ascii="Calibri" w:eastAsia="Times New Roman" w:hAnsi="Calibri" w:cs="Calibri"/>
+                <w:color w:val="000000"/>
+                <w:kern w:val="0"/>
+                <w:sz w:val="18"/>
+                <w:szCs w:val="18"/>
+                <w:lang w:eastAsia="pl-PL"/>
+                <w14:ligatures w14:val="none"/>
+              </w:rPr>
+              <w:t>ludnosci</w:t>
+            </w:r>
+            <w:proofErr w:type="spellEnd"/>
+            <w:r>
+              <w:rPr>
+                <w:rFonts w:ascii="Calibri" w:eastAsia="Times New Roman" w:hAnsi="Calibri" w:cs="Calibri"/>
+                <w:color w:val="000000"/>
+                <w:kern w:val="0"/>
+                <w:sz w:val="18"/>
+                <w:szCs w:val="18"/>
+                <w:lang w:eastAsia="pl-PL"/>
+                <w14:ligatures w14:val="none"/>
+              </w:rPr>
+              <w:t xml:space="preserve"> w wieku produkcyjnym - 2021 </w:t>
+            </w:r>
+            <w:proofErr w:type="spellStart"/>
+            <w:r>
+              <w:rPr>
+                <w:rFonts w:ascii="Calibri" w:eastAsia="Times New Roman" w:hAnsi="Calibri" w:cs="Calibri"/>
+                <w:color w:val="000000"/>
+                <w:kern w:val="0"/>
+                <w:sz w:val="18"/>
+                <w:szCs w:val="18"/>
+                <w:lang w:eastAsia="pl-PL"/>
+                <w14:ligatures w14:val="none"/>
+              </w:rPr>
+              <w:t>sp</w:t>
+            </w:r>
+            <w:proofErr w:type="spellEnd"/>
           </w:p>
         </w:tc>
       </w:tr>
@@ -7396,8 +8490,74 @@
                 <w:lang w:eastAsia="pl-PL"/>
                 <w14:ligatures w14:val="none"/>
               </w:rPr>
-              <w:t>odsetek ludnosci z wyksztalceniem wyzszym. 2021 sp</w:t>
-            </w:r>
+              <w:t xml:space="preserve">odsetek </w:t>
+            </w:r>
+            <w:proofErr w:type="spellStart"/>
+            <w:r>
+              <w:rPr>
+                <w:rFonts w:ascii="Calibri" w:eastAsia="Times New Roman" w:hAnsi="Calibri" w:cs="Calibri"/>
+                <w:color w:val="000000"/>
+                <w:kern w:val="0"/>
+                <w:sz w:val="18"/>
+                <w:szCs w:val="18"/>
+                <w:lang w:eastAsia="pl-PL"/>
+                <w14:ligatures w14:val="none"/>
+              </w:rPr>
+              <w:t>ludnosci</w:t>
+            </w:r>
+            <w:proofErr w:type="spellEnd"/>
+            <w:r>
+              <w:rPr>
+                <w:rFonts w:ascii="Calibri" w:eastAsia="Times New Roman" w:hAnsi="Calibri" w:cs="Calibri"/>
+                <w:color w:val="000000"/>
+                <w:kern w:val="0"/>
+                <w:sz w:val="18"/>
+                <w:szCs w:val="18"/>
+                <w:lang w:eastAsia="pl-PL"/>
+                <w14:ligatures w14:val="none"/>
+              </w:rPr>
+              <w:t xml:space="preserve"> z wyksztalceniem </w:t>
+            </w:r>
+            <w:proofErr w:type="spellStart"/>
+            <w:r>
+              <w:rPr>
+                <w:rFonts w:ascii="Calibri" w:eastAsia="Times New Roman" w:hAnsi="Calibri" w:cs="Calibri"/>
+                <w:color w:val="000000"/>
+                <w:kern w:val="0"/>
+                <w:sz w:val="18"/>
+                <w:szCs w:val="18"/>
+                <w:lang w:eastAsia="pl-PL"/>
+                <w14:ligatures w14:val="none"/>
+              </w:rPr>
+              <w:t>wyzszym</w:t>
+            </w:r>
+            <w:proofErr w:type="spellEnd"/>
+            <w:r>
+              <w:rPr>
+                <w:rFonts w:ascii="Calibri" w:eastAsia="Times New Roman" w:hAnsi="Calibri" w:cs="Calibri"/>
+                <w:color w:val="000000"/>
+                <w:kern w:val="0"/>
+                <w:sz w:val="18"/>
+                <w:szCs w:val="18"/>
+                <w:lang w:eastAsia="pl-PL"/>
+                <w14:ligatures w14:val="none"/>
+              </w:rPr>
+              <w:t xml:space="preserve">. 2021 </w:t>
+            </w:r>
+            <w:proofErr w:type="spellStart"/>
+            <w:r>
+              <w:rPr>
+                <w:rFonts w:ascii="Calibri" w:eastAsia="Times New Roman" w:hAnsi="Calibri" w:cs="Calibri"/>
+                <w:color w:val="000000"/>
+                <w:kern w:val="0"/>
+                <w:sz w:val="18"/>
+                <w:szCs w:val="18"/>
+                <w:lang w:eastAsia="pl-PL"/>
+                <w14:ligatures w14:val="none"/>
+              </w:rPr>
+              <w:t>sp</w:t>
+            </w:r>
+            <w:proofErr w:type="spellEnd"/>
           </w:p>
         </w:tc>
       </w:tr>
@@ -8460,6 +9620,7 @@
                 <w14:ligatures w14:val="none"/>
               </w:rPr>
             </w:pPr>
+            <w:proofErr w:type="spellStart"/>
             <w:r>
               <w:rPr>
                 <w:rFonts w:ascii="Calibri" w:eastAsia="Times New Roman" w:hAnsi="Calibri" w:cs="Calibri"/>
@@ -8470,8 +9631,35 @@
                 <w:lang w:eastAsia="pl-PL"/>
                 <w14:ligatures w14:val="none"/>
               </w:rPr>
-              <w:t>pkb na osobę w 2023 w 1000 zl</w:t>
-            </w:r>
+              <w:t>pkb</w:t>
+            </w:r>
+            <w:proofErr w:type="spellEnd"/>
+            <w:r>
+              <w:rPr>
+                <w:rFonts w:ascii="Calibri" w:eastAsia="Times New Roman" w:hAnsi="Calibri" w:cs="Calibri"/>
+                <w:color w:val="000000"/>
+                <w:kern w:val="0"/>
+                <w:sz w:val="20"/>
+                <w:szCs w:val="20"/>
+                <w:lang w:eastAsia="pl-PL"/>
+                <w14:ligatures w14:val="none"/>
+              </w:rPr>
+              <w:t xml:space="preserve"> na osobę w 2023 w 1000 </w:t>
+            </w:r>
+            <w:proofErr w:type="spellStart"/>
+            <w:r>
+              <w:rPr>
+                <w:rFonts w:ascii="Calibri" w:eastAsia="Times New Roman" w:hAnsi="Calibri" w:cs="Calibri"/>
+                <w:color w:val="000000"/>
+                <w:kern w:val="0"/>
+                <w:sz w:val="20"/>
+                <w:szCs w:val="20"/>
+                <w:lang w:eastAsia="pl-PL"/>
+                <w14:ligatures w14:val="none"/>
+              </w:rPr>
+              <w:t>zl</w:t>
+            </w:r>
+            <w:proofErr w:type="spellEnd"/>
           </w:p>
         </w:tc>
       </w:tr>
@@ -8596,7 +9784,33 @@
                 <w:lang w:eastAsia="pl-PL"/>
                 <w14:ligatures w14:val="none"/>
               </w:rPr>
-              <w:t>dochody budżetów województw na 1 mieszkanca w roku 2024 w dziesiątkach złotych</w:t>
+              <w:t xml:space="preserve">dochody budżetów województw na 1 </w:t>
+            </w:r>
+            <w:proofErr w:type="spellStart"/>
+            <w:r>
+              <w:rPr>
+                <w:rFonts w:ascii="Calibri" w:eastAsia="Times New Roman" w:hAnsi="Calibri" w:cs="Calibri"/>
+                <w:color w:val="000000"/>
+                <w:kern w:val="0"/>
+                <w:sz w:val="20"/>
+                <w:szCs w:val="20"/>
+                <w:lang w:eastAsia="pl-PL"/>
+                <w14:ligatures w14:val="none"/>
+              </w:rPr>
+              <w:t>mieszkanca</w:t>
+            </w:r>
+            <w:proofErr w:type="spellEnd"/>
+            <w:r>
+              <w:rPr>
+                <w:rFonts w:ascii="Calibri" w:eastAsia="Times New Roman" w:hAnsi="Calibri" w:cs="Calibri"/>
+                <w:color w:val="000000"/>
+                <w:kern w:val="0"/>
+                <w:sz w:val="20"/>
+                <w:szCs w:val="20"/>
+                <w:lang w:eastAsia="pl-PL"/>
+                <w14:ligatures w14:val="none"/>
+              </w:rPr>
+              <w:t xml:space="preserve"> w roku 2024 w dziesiątkach złotych</w:t>
             </w:r>
           </w:p>
         </w:tc>
@@ -9226,7 +10440,33 @@
                 <w:lang w:eastAsia="pl-PL"/>
                 <w14:ligatures w14:val="none"/>
               </w:rPr>
-              <w:t xml:space="preserve"> WYDATKI BUDŻETÓW GMIN I MIAST NA PRAWACH POWIATU na 1 mieszkanca w 2024 w setkach zł</w:t>
+              <w:t xml:space="preserve"> WYDATKI BUDŻETÓW GMIN I MIAST NA PRAWACH POWIATU na 1 </w:t>
+            </w:r>
+            <w:proofErr w:type="spellStart"/>
+            <w:r>
+              <w:rPr>
+                <w:rFonts w:ascii="Calibri" w:eastAsia="Times New Roman" w:hAnsi="Calibri" w:cs="Calibri"/>
+                <w:color w:val="000000"/>
+                <w:kern w:val="0"/>
+                <w:sz w:val="20"/>
+                <w:szCs w:val="20"/>
+                <w:lang w:eastAsia="pl-PL"/>
+                <w14:ligatures w14:val="none"/>
+              </w:rPr>
+              <w:t>mieszkanca</w:t>
+            </w:r>
+            <w:proofErr w:type="spellEnd"/>
+            <w:r>
+              <w:rPr>
+                <w:rFonts w:ascii="Calibri" w:eastAsia="Times New Roman" w:hAnsi="Calibri" w:cs="Calibri"/>
+                <w:color w:val="000000"/>
+                <w:kern w:val="0"/>
+                <w:sz w:val="20"/>
+                <w:szCs w:val="20"/>
+                <w:lang w:eastAsia="pl-PL"/>
+                <w14:ligatures w14:val="none"/>
+              </w:rPr>
+              <w:t xml:space="preserve"> w 2024 w setkach zł</w:t>
             </w:r>
           </w:p>
         </w:tc>
@@ -9478,7 +10718,33 @@
                 <w:lang w:eastAsia="pl-PL"/>
                 <w14:ligatures w14:val="none"/>
               </w:rPr>
-              <w:t>miejsca noclegowe na 1000 ludnosci w 2024</w:t>
+              <w:t xml:space="preserve">miejsca noclegowe na 1000 </w:t>
+            </w:r>
+            <w:proofErr w:type="spellStart"/>
+            <w:r>
+              <w:rPr>
+                <w:rFonts w:ascii="Calibri" w:eastAsia="Times New Roman" w:hAnsi="Calibri" w:cs="Calibri"/>
+                <w:color w:val="000000"/>
+                <w:kern w:val="0"/>
+                <w:sz w:val="20"/>
+                <w:szCs w:val="20"/>
+                <w:lang w:eastAsia="pl-PL"/>
+                <w14:ligatures w14:val="none"/>
+              </w:rPr>
+              <w:t>ludnosci</w:t>
+            </w:r>
+            <w:proofErr w:type="spellEnd"/>
+            <w:r>
+              <w:rPr>
+                <w:rFonts w:ascii="Calibri" w:eastAsia="Times New Roman" w:hAnsi="Calibri" w:cs="Calibri"/>
+                <w:color w:val="000000"/>
+                <w:kern w:val="0"/>
+                <w:sz w:val="20"/>
+                <w:szCs w:val="20"/>
+                <w:lang w:eastAsia="pl-PL"/>
+                <w14:ligatures w14:val="none"/>
+              </w:rPr>
+              <w:t xml:space="preserve"> w 2024</w:t>
             </w:r>
           </w:p>
         </w:tc>
@@ -9730,8 +10996,74 @@
                 <w:lang w:eastAsia="pl-PL"/>
                 <w14:ligatures w14:val="none"/>
               </w:rPr>
-              <w:t>odsetek ludnosci z wyksztalceniem wyzszym. 2021 sp</w:t>
-            </w:r>
+              <w:t xml:space="preserve">odsetek </w:t>
+            </w:r>
+            <w:proofErr w:type="spellStart"/>
+            <w:r>
+              <w:rPr>
+                <w:rFonts w:ascii="Calibri" w:eastAsia="Times New Roman" w:hAnsi="Calibri" w:cs="Calibri"/>
+                <w:color w:val="000000"/>
+                <w:kern w:val="0"/>
+                <w:sz w:val="20"/>
+                <w:szCs w:val="20"/>
+                <w:lang w:eastAsia="pl-PL"/>
+                <w14:ligatures w14:val="none"/>
+              </w:rPr>
+              <w:t>ludnosci</w:t>
+            </w:r>
+            <w:proofErr w:type="spellEnd"/>
+            <w:r>
+              <w:rPr>
+                <w:rFonts w:ascii="Calibri" w:eastAsia="Times New Roman" w:hAnsi="Calibri" w:cs="Calibri"/>
+                <w:color w:val="000000"/>
+                <w:kern w:val="0"/>
+                <w:sz w:val="20"/>
+                <w:szCs w:val="20"/>
+                <w:lang w:eastAsia="pl-PL"/>
+                <w14:ligatures w14:val="none"/>
+              </w:rPr>
+              <w:t xml:space="preserve"> z wyksztalceniem </w:t>
+            </w:r>
+            <w:proofErr w:type="spellStart"/>
+            <w:r>
+              <w:rPr>
+                <w:rFonts w:ascii="Calibri" w:eastAsia="Times New Roman" w:hAnsi="Calibri" w:cs="Calibri"/>
+                <w:color w:val="000000"/>
+                <w:kern w:val="0"/>
+                <w:sz w:val="20"/>
+                <w:szCs w:val="20"/>
+                <w:lang w:eastAsia="pl-PL"/>
+                <w14:ligatures w14:val="none"/>
+              </w:rPr>
+              <w:t>wyzszym</w:t>
+            </w:r>
+            <w:proofErr w:type="spellEnd"/>
+            <w:r>
+              <w:rPr>
+                <w:rFonts w:ascii="Calibri" w:eastAsia="Times New Roman" w:hAnsi="Calibri" w:cs="Calibri"/>
+                <w:color w:val="000000"/>
+                <w:kern w:val="0"/>
+                <w:sz w:val="20"/>
+                <w:szCs w:val="20"/>
+                <w:lang w:eastAsia="pl-PL"/>
+                <w14:ligatures w14:val="none"/>
+              </w:rPr>
+              <w:t xml:space="preserve">. 2021 </w:t>
+            </w:r>
+            <w:proofErr w:type="spellStart"/>
+            <w:r>
+              <w:rPr>
+                <w:rFonts w:ascii="Calibri" w:eastAsia="Times New Roman" w:hAnsi="Calibri" w:cs="Calibri"/>
+                <w:color w:val="000000"/>
+                <w:kern w:val="0"/>
+                <w:sz w:val="20"/>
+                <w:szCs w:val="20"/>
+                <w:lang w:eastAsia="pl-PL"/>
+                <w14:ligatures w14:val="none"/>
+              </w:rPr>
+              <w:t>sp</w:t>
+            </w:r>
+            <w:proofErr w:type="spellEnd"/>
           </w:p>
         </w:tc>
       </w:tr>
@@ -10286,6 +11618,7 @@
                 <w14:ligatures w14:val="none"/>
               </w:rPr>
             </w:pPr>
+            <w:proofErr w:type="spellStart"/>
             <w:r>
               <w:rPr>
                 <w:rFonts w:ascii="Calibri" w:eastAsia="Times New Roman" w:hAnsi="Calibri" w:cs="Calibri"/>
@@ -10296,8 +11629,35 @@
                 <w:lang w:eastAsia="pl-PL"/>
                 <w14:ligatures w14:val="none"/>
               </w:rPr>
-              <w:t>pkb na osobę w 2023 w 1000 zl</w:t>
-            </w:r>
+              <w:t>pkb</w:t>
+            </w:r>
+            <w:proofErr w:type="spellEnd"/>
+            <w:r>
+              <w:rPr>
+                <w:rFonts w:ascii="Calibri" w:eastAsia="Times New Roman" w:hAnsi="Calibri" w:cs="Calibri"/>
+                <w:color w:val="000000"/>
+                <w:kern w:val="0"/>
+                <w:sz w:val="22"/>
+                <w:szCs w:val="22"/>
+                <w:lang w:eastAsia="pl-PL"/>
+                <w14:ligatures w14:val="none"/>
+              </w:rPr>
+              <w:t xml:space="preserve"> na osobę w 2023 w 1000 </w:t>
+            </w:r>
+            <w:proofErr w:type="spellStart"/>
+            <w:r>
+              <w:rPr>
+                <w:rFonts w:ascii="Calibri" w:eastAsia="Times New Roman" w:hAnsi="Calibri" w:cs="Calibri"/>
+                <w:color w:val="000000"/>
+                <w:kern w:val="0"/>
+                <w:sz w:val="22"/>
+                <w:szCs w:val="22"/>
+                <w:lang w:eastAsia="pl-PL"/>
+                <w14:ligatures w14:val="none"/>
+              </w:rPr>
+              <w:t>zl</w:t>
+            </w:r>
+            <w:proofErr w:type="spellEnd"/>
           </w:p>
         </w:tc>
       </w:tr>
@@ -10422,7 +11782,33 @@
                 <w:lang w:eastAsia="pl-PL"/>
                 <w14:ligatures w14:val="none"/>
               </w:rPr>
-              <w:t>dochody budżetów województw na 1 mieszkanca w roku 2024 w dziesiątkach złotych]</w:t>
+              <w:t xml:space="preserve">dochody budżetów województw na 1 </w:t>
+            </w:r>
+            <w:proofErr w:type="spellStart"/>
+            <w:r>
+              <w:rPr>
+                <w:rFonts w:ascii="Calibri" w:eastAsia="Times New Roman" w:hAnsi="Calibri" w:cs="Calibri"/>
+                <w:color w:val="000000"/>
+                <w:kern w:val="0"/>
+                <w:sz w:val="22"/>
+                <w:szCs w:val="22"/>
+                <w:lang w:eastAsia="pl-PL"/>
+                <w14:ligatures w14:val="none"/>
+              </w:rPr>
+              <w:t>mieszkanca</w:t>
+            </w:r>
+            <w:proofErr w:type="spellEnd"/>
+            <w:r>
+              <w:rPr>
+                <w:rFonts w:ascii="Calibri" w:eastAsia="Times New Roman" w:hAnsi="Calibri" w:cs="Calibri"/>
+                <w:color w:val="000000"/>
+                <w:kern w:val="0"/>
+                <w:sz w:val="22"/>
+                <w:szCs w:val="22"/>
+                <w:lang w:eastAsia="pl-PL"/>
+                <w14:ligatures w14:val="none"/>
+              </w:rPr>
+              <w:t xml:space="preserve"> w roku 2024 w dziesiątkach złotych]</w:t>
             </w:r>
           </w:p>
         </w:tc>
@@ -11052,7 +12438,33 @@
                 <w:lang w:eastAsia="pl-PL"/>
                 <w14:ligatures w14:val="none"/>
               </w:rPr>
-              <w:t xml:space="preserve"> WYDATKI BUDŻETÓW GMIN I MIAST NA PRAWACH POWIATU na 1 mieszkanca w 2024 w setkach zł</w:t>
+              <w:t xml:space="preserve"> WYDATKI BUDŻETÓW GMIN I MIAST NA PRAWACH POWIATU na 1 </w:t>
+            </w:r>
+            <w:proofErr w:type="spellStart"/>
+            <w:r>
+              <w:rPr>
+                <w:rFonts w:ascii="Calibri" w:eastAsia="Times New Roman" w:hAnsi="Calibri" w:cs="Calibri"/>
+                <w:color w:val="000000"/>
+                <w:kern w:val="0"/>
+                <w:sz w:val="22"/>
+                <w:szCs w:val="22"/>
+                <w:lang w:eastAsia="pl-PL"/>
+                <w14:ligatures w14:val="none"/>
+              </w:rPr>
+              <w:t>mieszkanca</w:t>
+            </w:r>
+            <w:proofErr w:type="spellEnd"/>
+            <w:r>
+              <w:rPr>
+                <w:rFonts w:ascii="Calibri" w:eastAsia="Times New Roman" w:hAnsi="Calibri" w:cs="Calibri"/>
+                <w:color w:val="000000"/>
+                <w:kern w:val="0"/>
+                <w:sz w:val="22"/>
+                <w:szCs w:val="22"/>
+                <w:lang w:eastAsia="pl-PL"/>
+                <w14:ligatures w14:val="none"/>
+              </w:rPr>
+              <w:t xml:space="preserve"> w 2024 w setkach zł</w:t>
             </w:r>
           </w:p>
         </w:tc>
@@ -11304,7 +12716,33 @@
                 <w:lang w:eastAsia="pl-PL"/>
                 <w14:ligatures w14:val="none"/>
               </w:rPr>
-              <w:t>miejsca noclegowe na 1000 ludnosci w 2024</w:t>
+              <w:t xml:space="preserve">miejsca noclegowe na 1000 </w:t>
+            </w:r>
+            <w:proofErr w:type="spellStart"/>
+            <w:r>
+              <w:rPr>
+                <w:rFonts w:ascii="Calibri" w:eastAsia="Times New Roman" w:hAnsi="Calibri" w:cs="Calibri"/>
+                <w:color w:val="000000"/>
+                <w:kern w:val="0"/>
+                <w:sz w:val="22"/>
+                <w:szCs w:val="22"/>
+                <w:lang w:eastAsia="pl-PL"/>
+                <w14:ligatures w14:val="none"/>
+              </w:rPr>
+              <w:t>ludnosci</w:t>
+            </w:r>
+            <w:proofErr w:type="spellEnd"/>
+            <w:r>
+              <w:rPr>
+                <w:rFonts w:ascii="Calibri" w:eastAsia="Times New Roman" w:hAnsi="Calibri" w:cs="Calibri"/>
+                <w:color w:val="000000"/>
+                <w:kern w:val="0"/>
+                <w:sz w:val="22"/>
+                <w:szCs w:val="22"/>
+                <w:lang w:eastAsia="pl-PL"/>
+                <w14:ligatures w14:val="none"/>
+              </w:rPr>
+              <w:t xml:space="preserve"> w 2024</w:t>
             </w:r>
           </w:p>
         </w:tc>
@@ -11556,8 +12994,74 @@
                 <w:lang w:eastAsia="pl-PL"/>
                 <w14:ligatures w14:val="none"/>
               </w:rPr>
-              <w:t>odsetek ludnosci z wyksztalceniem wyzszym. 2021 sp</w:t>
-            </w:r>
+              <w:t xml:space="preserve">odsetek </w:t>
+            </w:r>
+            <w:proofErr w:type="spellStart"/>
+            <w:r>
+              <w:rPr>
+                <w:rFonts w:ascii="Calibri" w:eastAsia="Times New Roman" w:hAnsi="Calibri" w:cs="Calibri"/>
+                <w:color w:val="000000"/>
+                <w:kern w:val="0"/>
+                <w:sz w:val="22"/>
+                <w:szCs w:val="22"/>
+                <w:lang w:eastAsia="pl-PL"/>
+                <w14:ligatures w14:val="none"/>
+              </w:rPr>
+              <w:t>ludnosci</w:t>
+            </w:r>
+            <w:proofErr w:type="spellEnd"/>
+            <w:r>
+              <w:rPr>
+                <w:rFonts w:ascii="Calibri" w:eastAsia="Times New Roman" w:hAnsi="Calibri" w:cs="Calibri"/>
+                <w:color w:val="000000"/>
+                <w:kern w:val="0"/>
+                <w:sz w:val="22"/>
+                <w:szCs w:val="22"/>
+                <w:lang w:eastAsia="pl-PL"/>
+                <w14:ligatures w14:val="none"/>
+              </w:rPr>
+              <w:t xml:space="preserve"> z wyksztalceniem </w:t>
+            </w:r>
+            <w:proofErr w:type="spellStart"/>
+            <w:r>
+              <w:rPr>
+                <w:rFonts w:ascii="Calibri" w:eastAsia="Times New Roman" w:hAnsi="Calibri" w:cs="Calibri"/>
+                <w:color w:val="000000"/>
+                <w:kern w:val="0"/>
+                <w:sz w:val="22"/>
+                <w:szCs w:val="22"/>
+                <w:lang w:eastAsia="pl-PL"/>
+                <w14:ligatures w14:val="none"/>
+              </w:rPr>
+              <w:t>wyzszym</w:t>
+            </w:r>
+            <w:proofErr w:type="spellEnd"/>
+            <w:r>
+              <w:rPr>
+                <w:rFonts w:ascii="Calibri" w:eastAsia="Times New Roman" w:hAnsi="Calibri" w:cs="Calibri"/>
+                <w:color w:val="000000"/>
+                <w:kern w:val="0"/>
+                <w:sz w:val="22"/>
+                <w:szCs w:val="22"/>
+                <w:lang w:eastAsia="pl-PL"/>
+                <w14:ligatures w14:val="none"/>
+              </w:rPr>
+              <w:t xml:space="preserve">. 2021 </w:t>
+            </w:r>
+            <w:proofErr w:type="spellStart"/>
+            <w:r>
+              <w:rPr>
+                <w:rFonts w:ascii="Calibri" w:eastAsia="Times New Roman" w:hAnsi="Calibri" w:cs="Calibri"/>
+                <w:color w:val="000000"/>
+                <w:kern w:val="0"/>
+                <w:sz w:val="22"/>
+                <w:szCs w:val="22"/>
+                <w:lang w:eastAsia="pl-PL"/>
+                <w14:ligatures w14:val="none"/>
+              </w:rPr>
+              <w:t>sp</w:t>
+            </w:r>
+            <w:proofErr w:type="spellEnd"/>
           </w:p>
         </w:tc>
       </w:tr>
@@ -12281,7 +13785,13 @@
     </w:p>
     <w:p>
       <w:r>
-        <w:t xml:space="preserve">Na rysunku X przedstawiono wykres syntetyczny, który zestawia wszystkie analizowane zmienne w ramach jednej przestrzeni badawczej. Wyraźnie widać, że podczas gdy większość cech charakteryzuje się stabilnymi i umiarkowanymi parametrami, część wskaźników drastycznie od nich odstaje. Oznacza to, że w badanym zbiorze mamy zarówno zmienne będące silnymi determinantami nierówności społeczno-gospodarczych, jak i takie, które te różnice wygładzają. Z punktu widzenia metodologicznego jest to sytuacja </w:t>
+        <w:t xml:space="preserve">Na rysunku </w:t>
+      </w:r>
+      <w:r>
+        <w:t>4</w:t>
+      </w:r>
+      <w:r>
+        <w:t xml:space="preserve"> przedstawiono wykres syntetyczny, który zestawia wszystkie analizowane zmienne w ramach jednej przestrzeni badawczej. Wyraźnie widać, że podczas gdy większość cech charakteryzuje się stabilnymi i umiarkowanymi parametrami, część wskaźników drastycznie od nich odstaje. Oznacza to, że w badanym zbiorze mamy zarówno zmienne będące silnymi determinantami nierówności społeczno-gospodarczych, jak i takie, które te różnice wygładzają. Z punktu widzenia metodologicznego jest to sytuacja </w:t>
       </w:r>
       <w:r>
         <w:t xml:space="preserve">korzystna, ponieważ </w:t>
@@ -12305,13 +13815,146 @@
         <w:t>Analiza korelacji</w:t>
       </w:r>
     </w:p>
-    <w:p/>
+    <w:p>
+      <w:r>
+        <w:t xml:space="preserve">Na rysunku 5 przedstawiono pełną macierz korelacji liniowych między wszystkimi cechami wchodzącymi w skład analizowanego zbioru danych. Wizualizacja ta ujawnia wyraźną tendencję do tworzenia się silnie powiązanych bloków tematycznych. Wzajemną, ścisłą zależnością charakteryzują się przede wszystkim zmienne z przedziału od </w:t>
+      </w:r>
+      <m:oMath>
+        <m:sSub>
+          <m:sSubPr>
+            <m:ctrlPr>
+              <w:rPr>
+                <w:rFonts w:ascii="Cambria Math" w:hAnsi="Cambria Math"/>
+              </w:rPr>
+            </m:ctrlPr>
+          </m:sSubPr>
+          <m:e>
+            <m:r>
+              <w:rPr>
+                <w:rFonts w:ascii="Cambria Math" w:hAnsi="Cambria Math"/>
+              </w:rPr>
+              <m:t>x</m:t>
+            </m:r>
+          </m:e>
+          <m:sub>
+            <m:r>
+              <w:rPr>
+                <w:rFonts w:ascii="Cambria Math" w:hAnsi="Cambria Math"/>
+              </w:rPr>
+              <m:t>11</m:t>
+            </m:r>
+          </m:sub>
+        </m:sSub>
+      </m:oMath>
+      <w:r>
+        <w:t xml:space="preserve"> do </w:t>
+      </w:r>
+      <m:oMath>
+        <m:sSub>
+          <m:sSubPr>
+            <m:ctrlPr>
+              <w:rPr>
+                <w:rFonts w:ascii="Cambria Math" w:hAnsi="Cambria Math"/>
+              </w:rPr>
+            </m:ctrlPr>
+          </m:sSubPr>
+          <m:e>
+            <m:r>
+              <w:rPr>
+                <w:rFonts w:ascii="Cambria Math" w:hAnsi="Cambria Math"/>
+              </w:rPr>
+              <m:t>x</m:t>
+            </m:r>
+          </m:e>
+          <m:sub>
+            <m:r>
+              <w:rPr>
+                <w:rFonts w:ascii="Cambria Math" w:hAnsi="Cambria Math"/>
+              </w:rPr>
+              <m:t>15</m:t>
+            </m:r>
+          </m:sub>
+        </m:sSub>
+      </m:oMath>
+      <w:r>
+        <w:t xml:space="preserve">, reprezentujące sferę </w:t>
+      </w:r>
+      <w:r>
+        <w:t>gospodarki</w:t>
+      </w:r>
+      <w:r>
+        <w:t xml:space="preserve"> oraz wskaźniki od </w:t>
+      </w:r>
+      <m:oMath>
+        <m:sSub>
+          <m:sSubPr>
+            <m:ctrlPr>
+              <w:rPr>
+                <w:rFonts w:ascii="Cambria Math" w:hAnsi="Cambria Math"/>
+              </w:rPr>
+            </m:ctrlPr>
+          </m:sSubPr>
+          <m:e>
+            <m:r>
+              <w:rPr>
+                <w:rFonts w:ascii="Cambria Math" w:hAnsi="Cambria Math"/>
+              </w:rPr>
+              <m:t>x</m:t>
+            </m:r>
+          </m:e>
+          <m:sub>
+            <m:r>
+              <w:rPr>
+                <w:rFonts w:ascii="Cambria Math" w:hAnsi="Cambria Math"/>
+              </w:rPr>
+              <m:t>27</m:t>
+            </m:r>
+          </m:sub>
+        </m:sSub>
+      </m:oMath>
+      <w:r>
+        <w:t xml:space="preserve"> do </w:t>
+      </w:r>
+      <m:oMath>
+        <m:sSub>
+          <m:sSubPr>
+            <m:ctrlPr>
+              <w:rPr>
+                <w:rFonts w:ascii="Cambria Math" w:hAnsi="Cambria Math"/>
+              </w:rPr>
+            </m:ctrlPr>
+          </m:sSubPr>
+          <m:e>
+            <m:r>
+              <w:rPr>
+                <w:rFonts w:ascii="Cambria Math" w:hAnsi="Cambria Math"/>
+              </w:rPr>
+              <m:t>x</m:t>
+            </m:r>
+          </m:e>
+          <m:sub>
+            <m:r>
+              <w:rPr>
+                <w:rFonts w:ascii="Cambria Math" w:hAnsi="Cambria Math"/>
+              </w:rPr>
+              <m:t>32</m:t>
+            </m:r>
+          </m:sub>
+        </m:sSub>
+      </m:oMath>
+      <w:r>
+        <w:t xml:space="preserve">, opisujące nakłady i wydatki inwestycyjne. Takie ustrukturyzowanie przestrzeni informacyjnej stanowi kluczowy punkt wyjścia oraz merytoryczne uzasadnienie dla kolejnych kroków </w:t>
+      </w:r>
+      <w:r>
+        <w:lastRenderedPageBreak/>
+        <w:t>badawczych, w tym redukcji wymiarowości oraz analizy kanonicznej. W celu pogłębienia tej obserwacji wyizolowano 25 najsilniejszych współczynników korelacji (dodatnich oraz ujemnych), które szczegółowo zilustrowano na rysunkach 6 oraz 7.</w:t>
+      </w:r>
+    </w:p>
     <w:p>
       <w:pPr>
         <w:keepNext/>
       </w:pPr>
       <w:r>
-        <w:lastRenderedPageBreak/>
         <w:drawing>
           <wp:inline distT="0" distB="0" distL="0" distR="0" wp14:anchorId="319FA603" wp14:editId="65A215DD">
             <wp:extent cx="5760720" cy="5212715"/>
@@ -12382,14 +14025,15 @@
     <w:p>
       <w:pPr>
         <w:keepNext/>
+        <w:jc w:val="center"/>
       </w:pPr>
       <w:r>
         <w:rPr>
           <w:noProof/>
         </w:rPr>
         <w:drawing>
-          <wp:inline distT="0" distB="0" distL="0" distR="0" wp14:anchorId="63B4DB4A" wp14:editId="36DAB5F1">
-            <wp:extent cx="5760720" cy="2515235"/>
+          <wp:inline distT="0" distB="0" distL="0" distR="0" wp14:anchorId="63B4DB4A" wp14:editId="54784105">
+            <wp:extent cx="5029200" cy="2195841"/>
             <wp:effectExtent l="0" t="0" r="0" b="0"/>
             <wp:docPr id="1868396660" name="Picture 7"/>
             <wp:cNvGraphicFramePr>
@@ -12405,7 +14049,7 @@
                     </pic:cNvPicPr>
                   </pic:nvPicPr>
                   <pic:blipFill>
-                    <a:blip r:embed="rId22">
+                    <a:blip r:embed="rId22" cstate="print">
                       <a:extLst>
                         <a:ext uri="{28A0092B-C50C-407E-A947-70E740481C1C}">
                           <a14:useLocalDpi xmlns:a14="http://schemas.microsoft.com/office/drawing/2010/main" val="0"/>
@@ -12420,7 +14064,7 @@
                   <pic:spPr bwMode="auto">
                     <a:xfrm>
                       <a:off x="0" y="0"/>
-                      <a:ext cx="5760720" cy="2515235"/>
+                      <a:ext cx="5035437" cy="2198564"/>
                     </a:xfrm>
                     <a:prstGeom prst="rect">
                       <a:avLst/>
@@ -12480,7 +14124,6 @@
         <w:rPr>
           <w:noProof/>
         </w:rPr>
-        <w:lastRenderedPageBreak/>
         <w:drawing>
           <wp:inline distT="0" distB="0" distL="0" distR="0" wp14:anchorId="319C77F4" wp14:editId="68E522B6">
             <wp:extent cx="5318760" cy="5981700"/>
@@ -12897,12 +14540,21 @@
                 <w:szCs w:val="18"/>
               </w:rPr>
             </w:pPr>
-            <w:r>
-              <w:rPr>
-                <w:sz w:val="18"/>
-                <w:szCs w:val="18"/>
-              </w:rPr>
-              <w:t>pkb na osobę w 2023 w 1000 zł</w:t>
+            <w:proofErr w:type="spellStart"/>
+            <w:r>
+              <w:rPr>
+                <w:sz w:val="18"/>
+                <w:szCs w:val="18"/>
+              </w:rPr>
+              <w:t>pkb</w:t>
+            </w:r>
+            <w:proofErr w:type="spellEnd"/>
+            <w:r>
+              <w:rPr>
+                <w:sz w:val="18"/>
+                <w:szCs w:val="18"/>
+              </w:rPr>
+              <w:t xml:space="preserve"> na osobę w 2023 w 1000 zł</w:t>
             </w:r>
           </w:p>
         </w:tc>
@@ -13225,12 +14877,21 @@
                 <w:szCs w:val="18"/>
               </w:rPr>
             </w:pPr>
-            <w:r>
-              <w:rPr>
-                <w:sz w:val="18"/>
-                <w:szCs w:val="18"/>
-              </w:rPr>
-              <w:t>pkb na osobę w 2023 w 1000 zł</w:t>
+            <w:proofErr w:type="spellStart"/>
+            <w:r>
+              <w:rPr>
+                <w:sz w:val="18"/>
+                <w:szCs w:val="18"/>
+              </w:rPr>
+              <w:t>pkb</w:t>
+            </w:r>
+            <w:proofErr w:type="spellEnd"/>
+            <w:r>
+              <w:rPr>
+                <w:sz w:val="18"/>
+                <w:szCs w:val="18"/>
+              </w:rPr>
+              <w:t xml:space="preserve"> na osobę w 2023 w 1000 zł</w:t>
             </w:r>
           </w:p>
         </w:tc>
@@ -13557,8 +15218,17 @@
                 <w:sz w:val="18"/>
                 <w:szCs w:val="18"/>
               </w:rPr>
-              <w:t>odsetek ludności w wieku produkcyjnym - 2021 sp</w:t>
-            </w:r>
+              <w:t xml:space="preserve">odsetek ludności w wieku produkcyjnym - 2021 </w:t>
+            </w:r>
+            <w:proofErr w:type="spellStart"/>
+            <w:r>
+              <w:rPr>
+                <w:sz w:val="18"/>
+                <w:szCs w:val="18"/>
+              </w:rPr>
+              <w:t>sp</w:t>
+            </w:r>
+            <w:proofErr w:type="spellEnd"/>
           </w:p>
         </w:tc>
         <w:tc>
@@ -13666,8 +15336,17 @@
                 <w:sz w:val="18"/>
                 <w:szCs w:val="18"/>
               </w:rPr>
-              <w:t>odsetek ludności w wieku produkcyjnym - 2021 sp</w:t>
-            </w:r>
+              <w:t xml:space="preserve">odsetek ludności w wieku produkcyjnym - 2021 </w:t>
+            </w:r>
+            <w:proofErr w:type="spellStart"/>
+            <w:r>
+              <w:rPr>
+                <w:sz w:val="18"/>
+                <w:szCs w:val="18"/>
+              </w:rPr>
+              <w:t>sp</w:t>
+            </w:r>
+            <w:proofErr w:type="spellEnd"/>
           </w:p>
         </w:tc>
         <w:tc>
@@ -13879,12 +15558,37 @@
                 <w:szCs w:val="18"/>
               </w:rPr>
             </w:pPr>
-            <w:r>
-              <w:rPr>
-                <w:sz w:val="18"/>
-                <w:szCs w:val="18"/>
-              </w:rPr>
-              <w:t>wskaznik urbanizacji 2021 - spis powszechny - ile osob % mieszka w miastach</w:t>
+            <w:proofErr w:type="spellStart"/>
+            <w:r>
+              <w:rPr>
+                <w:sz w:val="18"/>
+                <w:szCs w:val="18"/>
+              </w:rPr>
+              <w:t>wskaznik</w:t>
+            </w:r>
+            <w:proofErr w:type="spellEnd"/>
+            <w:r>
+              <w:rPr>
+                <w:sz w:val="18"/>
+                <w:szCs w:val="18"/>
+              </w:rPr>
+              <w:t xml:space="preserve"> urbanizacji 2021 - spis powszechny - ile </w:t>
+            </w:r>
+            <w:proofErr w:type="spellStart"/>
+            <w:r>
+              <w:rPr>
+                <w:sz w:val="18"/>
+                <w:szCs w:val="18"/>
+              </w:rPr>
+              <w:t>osob</w:t>
+            </w:r>
+            <w:proofErr w:type="spellEnd"/>
+            <w:r>
+              <w:rPr>
+                <w:sz w:val="18"/>
+                <w:szCs w:val="18"/>
+              </w:rPr>
+              <w:t xml:space="preserve"> % mieszka w miastach</w:t>
             </w:r>
           </w:p>
         </w:tc>
@@ -13918,8 +15622,33 @@
                 <w:sz w:val="18"/>
                 <w:szCs w:val="18"/>
               </w:rPr>
-              <w:t>zasoby mieszkaniowe gim komunalne 2024 na 10,000 mieszkancow</w:t>
-            </w:r>
+              <w:t xml:space="preserve">zasoby mieszkaniowe </w:t>
+            </w:r>
+            <w:proofErr w:type="spellStart"/>
+            <w:r>
+              <w:rPr>
+                <w:sz w:val="18"/>
+                <w:szCs w:val="18"/>
+              </w:rPr>
+              <w:t>gim</w:t>
+            </w:r>
+            <w:proofErr w:type="spellEnd"/>
+            <w:r>
+              <w:rPr>
+                <w:sz w:val="18"/>
+                <w:szCs w:val="18"/>
+              </w:rPr>
+              <w:t xml:space="preserve"> komunalne 2024 na 10,000 </w:t>
+            </w:r>
+            <w:proofErr w:type="spellStart"/>
+            <w:r>
+              <w:rPr>
+                <w:sz w:val="18"/>
+                <w:szCs w:val="18"/>
+              </w:rPr>
+              <w:t>mieszkancow</w:t>
+            </w:r>
+            <w:proofErr w:type="spellEnd"/>
           </w:p>
         </w:tc>
       </w:tr>
@@ -13988,12 +15717,21 @@
                 <w:szCs w:val="18"/>
               </w:rPr>
             </w:pPr>
-            <w:r>
-              <w:rPr>
-                <w:sz w:val="18"/>
-                <w:szCs w:val="18"/>
-              </w:rPr>
-              <w:t>pkb na osobę w 2023 w 1000 zł</w:t>
+            <w:proofErr w:type="spellStart"/>
+            <w:r>
+              <w:rPr>
+                <w:sz w:val="18"/>
+                <w:szCs w:val="18"/>
+              </w:rPr>
+              <w:t>pkb</w:t>
+            </w:r>
+            <w:proofErr w:type="spellEnd"/>
+            <w:r>
+              <w:rPr>
+                <w:sz w:val="18"/>
+                <w:szCs w:val="18"/>
+              </w:rPr>
+              <w:t xml:space="preserve"> na osobę w 2023 w 1000 zł</w:t>
             </w:r>
           </w:p>
         </w:tc>
@@ -14136,8 +15874,17 @@
                 <w:sz w:val="18"/>
                 <w:szCs w:val="18"/>
               </w:rPr>
-              <w:t>odsetek ludności z wykształceniem wyższym. 2021 sp</w:t>
-            </w:r>
+              <w:t xml:space="preserve">odsetek ludności z wykształceniem wyższym. 2021 </w:t>
+            </w:r>
+            <w:proofErr w:type="spellStart"/>
+            <w:r>
+              <w:rPr>
+                <w:sz w:val="18"/>
+                <w:szCs w:val="18"/>
+              </w:rPr>
+              <w:t>sp</w:t>
+            </w:r>
+            <w:proofErr w:type="spellEnd"/>
           </w:p>
         </w:tc>
       </w:tr>
@@ -14573,7 +16320,23 @@
                 <w:sz w:val="18"/>
                 <w:szCs w:val="18"/>
               </w:rPr>
-              <w:t>Lekarze dentyści pracujący bezpośrednio z pacjentem według województw – na 10 tys Mieszkańców – stan 31 grudnia 2023</w:t>
+              <w:t xml:space="preserve">Lekarze dentyści pracujący bezpośrednio z pacjentem według województw – na 10 </w:t>
+            </w:r>
+            <w:proofErr w:type="spellStart"/>
+            <w:r>
+              <w:rPr>
+                <w:sz w:val="18"/>
+                <w:szCs w:val="18"/>
+              </w:rPr>
+              <w:t>tys</w:t>
+            </w:r>
+            <w:proofErr w:type="spellEnd"/>
+            <w:r>
+              <w:rPr>
+                <w:sz w:val="18"/>
+                <w:szCs w:val="18"/>
+              </w:rPr>
+              <w:t xml:space="preserve"> Mieszkańców – stan 31 grudnia 2023</w:t>
             </w:r>
           </w:p>
         </w:tc>
@@ -14861,12 +16624,21 @@
                 <w:szCs w:val="18"/>
               </w:rPr>
             </w:pPr>
-            <w:r>
-              <w:rPr>
-                <w:sz w:val="18"/>
-                <w:szCs w:val="18"/>
-              </w:rPr>
-              <w:t>pkb na osobę w 2023 w 1000 zł</w:t>
+            <w:proofErr w:type="spellStart"/>
+            <w:r>
+              <w:rPr>
+                <w:sz w:val="18"/>
+                <w:szCs w:val="18"/>
+              </w:rPr>
+              <w:t>pkb</w:t>
+            </w:r>
+            <w:proofErr w:type="spellEnd"/>
+            <w:r>
+              <w:rPr>
+                <w:sz w:val="18"/>
+                <w:szCs w:val="18"/>
+              </w:rPr>
+              <w:t xml:space="preserve"> na osobę w 2023 w 1000 zł</w:t>
             </w:r>
           </w:p>
         </w:tc>
@@ -15227,8 +16999,17 @@
                 <w:sz w:val="18"/>
                 <w:szCs w:val="18"/>
               </w:rPr>
-              <w:t>odsetek ludności z wykształceniem wyższym. 2021 sp</w:t>
-            </w:r>
+              <w:t xml:space="preserve">odsetek ludności z wykształceniem wyższym. 2021 </w:t>
+            </w:r>
+            <w:proofErr w:type="spellStart"/>
+            <w:r>
+              <w:rPr>
+                <w:sz w:val="18"/>
+                <w:szCs w:val="18"/>
+              </w:rPr>
+              <w:t>sp</w:t>
+            </w:r>
+            <w:proofErr w:type="spellEnd"/>
           </w:p>
         </w:tc>
       </w:tr>
@@ -15343,6 +17124,242 @@
       </w:tr>
     </w:tbl>
     <w:p/>
+    <w:p>
+      <w:r>
+        <w:t xml:space="preserve">Analiza najsilniejszych współczynników korelacji liniowej pozwala na zidentyfikowanie oczywistych, silnych sprzężeń strukturalnych w badanych województwach. Na </w:t>
+      </w:r>
+      <w:r>
+        <w:lastRenderedPageBreak/>
+        <w:t>szczególną uwagę zasługują potężne, dodatnie korelacje wewnątrz bloku gospodarczo-inwestycyjnego (np. relacje między PKB (</w:t>
+      </w:r>
+      <m:oMath>
+        <m:sSub>
+          <m:sSubPr>
+            <m:ctrlPr>
+              <w:rPr>
+                <w:rFonts w:ascii="Cambria Math" w:hAnsi="Cambria Math"/>
+              </w:rPr>
+            </m:ctrlPr>
+          </m:sSubPr>
+          <m:e>
+            <m:r>
+              <w:rPr>
+                <w:rFonts w:ascii="Cambria Math" w:hAnsi="Cambria Math"/>
+              </w:rPr>
+              <m:t>x</m:t>
+            </m:r>
+          </m:e>
+          <m:sub>
+            <m:r>
+              <w:rPr>
+                <w:rFonts w:ascii="Cambria Math" w:hAnsi="Cambria Math"/>
+              </w:rPr>
+              <m:t>11</m:t>
+            </m:r>
+          </m:sub>
+        </m:sSub>
+      </m:oMath>
+      <w:r>
+        <w:t>), dochodami budżetów (</w:t>
+      </w:r>
+      <m:oMath>
+        <m:sSub>
+          <m:sSubPr>
+            <m:ctrlPr>
+              <w:rPr>
+                <w:rFonts w:ascii="Cambria Math" w:hAnsi="Cambria Math"/>
+              </w:rPr>
+            </m:ctrlPr>
+          </m:sSubPr>
+          <m:e>
+            <m:r>
+              <w:rPr>
+                <w:rFonts w:ascii="Cambria Math" w:hAnsi="Cambria Math"/>
+              </w:rPr>
+              <m:t>x</m:t>
+            </m:r>
+          </m:e>
+          <m:sub>
+            <m:r>
+              <w:rPr>
+                <w:rFonts w:ascii="Cambria Math" w:hAnsi="Cambria Math"/>
+              </w:rPr>
+              <m:t>13</m:t>
+            </m:r>
+          </m:sub>
+        </m:sSub>
+      </m:oMath>
+      <w:r>
+        <w:t>), nakładami inwestycyjnymi (</w:t>
+      </w:r>
+      <m:oMath>
+        <m:sSub>
+          <m:sSubPr>
+            <m:ctrlPr>
+              <w:rPr>
+                <w:rFonts w:ascii="Cambria Math" w:hAnsi="Cambria Math"/>
+              </w:rPr>
+            </m:ctrlPr>
+          </m:sSubPr>
+          <m:e>
+            <m:r>
+              <w:rPr>
+                <w:rFonts w:ascii="Cambria Math" w:hAnsi="Cambria Math"/>
+              </w:rPr>
+              <m:t>x</m:t>
+            </m:r>
+          </m:e>
+          <m:sub>
+            <m:r>
+              <w:rPr>
+                <w:rFonts w:ascii="Cambria Math" w:hAnsi="Cambria Math"/>
+              </w:rPr>
+              <m:t>27</m:t>
+            </m:r>
+          </m:sub>
+        </m:sSub>
+      </m:oMath>
+      <w:r>
+        <w:t xml:space="preserve">) oraz wynagrodzeniami </w:t>
+      </w:r>
+      <m:oMath>
+        <m:r>
+          <w:rPr>
+            <w:rFonts w:ascii="Cambria Math" w:hAnsi="Cambria Math"/>
+          </w:rPr>
+          <m:t>(</m:t>
+        </m:r>
+        <m:sSub>
+          <m:sSubPr>
+            <m:ctrlPr>
+              <w:rPr>
+                <w:rFonts w:ascii="Cambria Math" w:hAnsi="Cambria Math"/>
+              </w:rPr>
+            </m:ctrlPr>
+          </m:sSubPr>
+          <m:e>
+            <m:r>
+              <w:rPr>
+                <w:rFonts w:ascii="Cambria Math" w:hAnsi="Cambria Math"/>
+              </w:rPr>
+              <m:t>x</m:t>
+            </m:r>
+          </m:e>
+          <m:sub>
+            <m:r>
+              <w:rPr>
+                <w:rFonts w:ascii="Cambria Math" w:hAnsi="Cambria Math"/>
+              </w:rPr>
+              <m:t>15</m:t>
+            </m:r>
+          </m:sub>
+        </m:sSub>
+      </m:oMath>
+      <w:r>
+        <w:t>)), co potwierdza istnienie silnego mechanizmu samonapędzającego się rozwoju bogatszych regionów. Z kolei jedyne w zestawieniu silne korelacje ujemne (bliskie</w:t>
+      </w:r>
+      <m:oMath>
+        <m:r>
+          <w:rPr>
+            <w:rFonts w:ascii="Cambria Math" w:hAnsi="Cambria Math"/>
+          </w:rPr>
+          <m:t>-0.92</m:t>
+        </m:r>
+      </m:oMath>
+      <w:r>
+        <w:t>) dotyczą relacji zasobów ludzkich: im wyższy odsetek ludności w wieku produkcyjnym (</w:t>
+      </w:r>
+      <m:oMath>
+        <m:sSub>
+          <m:sSubPr>
+            <m:ctrlPr>
+              <w:rPr>
+                <w:rFonts w:ascii="Cambria Math" w:hAnsi="Cambria Math"/>
+              </w:rPr>
+            </m:ctrlPr>
+          </m:sSubPr>
+          <m:e>
+            <m:r>
+              <w:rPr>
+                <w:rFonts w:ascii="Cambria Math" w:hAnsi="Cambria Math"/>
+              </w:rPr>
+              <m:t>x</m:t>
+            </m:r>
+          </m:e>
+          <m:sub>
+            <m:r>
+              <w:rPr>
+                <w:rFonts w:ascii="Cambria Math" w:hAnsi="Cambria Math"/>
+              </w:rPr>
+              <m:t>53</m:t>
+            </m:r>
+          </m:sub>
+        </m:sSub>
+      </m:oMath>
+      <w:r>
+        <w:t>), tym mniejsze obciążenie demograficzne regionu (</w:t>
+      </w:r>
+      <m:oMath>
+        <m:sSub>
+          <m:sSubPr>
+            <m:ctrlPr>
+              <w:rPr>
+                <w:rFonts w:ascii="Cambria Math" w:hAnsi="Cambria Math"/>
+              </w:rPr>
+            </m:ctrlPr>
+          </m:sSubPr>
+          <m:e>
+            <m:r>
+              <w:rPr>
+                <w:rFonts w:ascii="Cambria Math" w:hAnsi="Cambria Math"/>
+              </w:rPr>
+              <m:t>x</m:t>
+            </m:r>
+          </m:e>
+          <m:sub>
+            <m:r>
+              <w:rPr>
+                <w:rFonts w:ascii="Cambria Math" w:hAnsi="Cambria Math"/>
+              </w:rPr>
+              <m:t>55</m:t>
+            </m:r>
+          </m:sub>
+        </m:sSub>
+      </m:oMath>
+      <w:r>
+        <w:t xml:space="preserve"> i </w:t>
+      </w:r>
+      <m:oMath>
+        <m:sSub>
+          <m:sSubPr>
+            <m:ctrlPr>
+              <w:rPr>
+                <w:rFonts w:ascii="Cambria Math" w:hAnsi="Cambria Math"/>
+              </w:rPr>
+            </m:ctrlPr>
+          </m:sSubPr>
+          <m:e>
+            <m:r>
+              <w:rPr>
+                <w:rFonts w:ascii="Cambria Math" w:hAnsi="Cambria Math"/>
+              </w:rPr>
+              <m:t>x</m:t>
+            </m:r>
+          </m:e>
+          <m:sub>
+            <m:r>
+              <w:rPr>
+                <w:rFonts w:ascii="Cambria Math" w:hAnsi="Cambria Math"/>
+              </w:rPr>
+              <m:t>56</m:t>
+            </m:r>
+          </m:sub>
+        </m:sSub>
+      </m:oMath>
+      <w:r>
+        <w:t>), co logicznie odzwierciedla procesy starzenia się społeczeństwa dotykające konkretne województwa w nierównomiernym stopniu.</w:t>
+      </w:r>
+    </w:p>
     <w:sectPr>
       <w:footerReference w:type="default" r:id="rId24"/>
       <w:pgSz w:w="11906" w:h="16838"/>

</xml_diff>